<commit_message>
The rootme ctf was completed
</commit_message>
<xml_diff>
--- a/THM_challenges/Easy/RootMe/RootMe_Solution_Documentation.docx
+++ b/THM_challenges/Easy/RootMe/RootMe_Solution_Documentation.docx
@@ -1,29 +1,25 @@
 
 <file path=word/document.xml><?xml version="1.0" encoding="utf-8"?>
-<w:document xmlns:wpc="http://schemas.microsoft.com/office/word/2010/wordprocessingCanvas" xmlns:mc="http://schemas.openxmlformats.org/markup-compatibility/2006" xmlns:o="urn:schemas-microsoft-com:office:office" xmlns:r="http://schemas.openxmlformats.org/officeDocument/2006/relationships" xmlns:m="http://schemas.openxmlformats.org/officeDocument/2006/math" xmlns:v="urn:schemas-microsoft-com:vml" xmlns:wp14="http://schemas.microsoft.com/office/word/2010/wordprocessingDrawing" xmlns:wp="http://schemas.openxmlformats.org/drawingml/2006/wordprocessingDrawing" xmlns:w="http://schemas.openxmlformats.org/wordprocessingml/2006/main" xmlns:w14="http://schemas.microsoft.com/office/word/2010/wordml" xmlns:w10="urn:schemas-microsoft-com:office:word" xmlns:w15="http://schemas.microsoft.com/office/word/2012/wordml" xmlns:wpg="http://schemas.microsoft.com/office/word/2010/wordprocessingGroup" xmlns:wpi="http://schemas.microsoft.com/office/word/2010/wordprocessingInk" xmlns:wne="http://schemas.microsoft.com/office/word/2006/wordml" xmlns:wps="http://schemas.microsoft.com/office/word/2010/wordprocessingShape" xmlns:wpsCustomData="http://www.wps.cn/officeDocument/2013/wpsCustomData" mc:Ignorable="w14 w15 wp14">
+<w:document xmlns:wpc="http://schemas.microsoft.com/office/word/2010/wordprocessingCanvas" xmlns:cx="http://schemas.microsoft.com/office/drawing/2014/chartex" xmlns:cx1="http://schemas.microsoft.com/office/drawing/2015/9/8/chartex" xmlns:cx2="http://schemas.microsoft.com/office/drawing/2015/10/21/chartex" xmlns:cx3="http://schemas.microsoft.com/office/drawing/2016/5/9/chartex" xmlns:cx4="http://schemas.microsoft.com/office/drawing/2016/5/10/chartex" xmlns:cx5="http://schemas.microsoft.com/office/drawing/2016/5/11/chartex" xmlns:cx6="http://schemas.microsoft.com/office/drawing/2016/5/12/chartex" xmlns:cx7="http://schemas.microsoft.com/office/drawing/2016/5/13/chartex" xmlns:cx8="http://schemas.microsoft.com/office/drawing/2016/5/14/chartex" xmlns:mc="http://schemas.openxmlformats.org/markup-compatibility/2006" xmlns:aink="http://schemas.microsoft.com/office/drawing/2016/ink" xmlns:am3d="http://schemas.microsoft.com/office/drawing/2017/model3d" xmlns:o="urn:schemas-microsoft-com:office:office" xmlns:oel="http://schemas.microsoft.com/office/2019/extlst" xmlns:r="http://schemas.openxmlformats.org/officeDocument/2006/relationships" xmlns:m="http://schemas.openxmlformats.org/officeDocument/2006/math" xmlns:v="urn:schemas-microsoft-com:vml" xmlns:wp14="http://schemas.microsoft.com/office/word/2010/wordprocessingDrawing" xmlns:wp="http://schemas.openxmlformats.org/drawingml/2006/wordprocessingDrawing" xmlns:w10="urn:schemas-microsoft-com:office:word" xmlns:w="http://schemas.openxmlformats.org/wordprocessingml/2006/main" xmlns:w14="http://schemas.microsoft.com/office/word/2010/wordml" xmlns:w15="http://schemas.microsoft.com/office/word/2012/wordml" xmlns:w16cex="http://schemas.microsoft.com/office/word/2018/wordml/cex" xmlns:w16cid="http://schemas.microsoft.com/office/word/2016/wordml/cid" xmlns:w16="http://schemas.microsoft.com/office/word/2018/wordml" xmlns:w16du="http://schemas.microsoft.com/office/word/2023/wordml/word16du" xmlns:w16sdtdh="http://schemas.microsoft.com/office/word/2020/wordml/sdtdatahash" xmlns:w16sdtfl="http://schemas.microsoft.com/office/word/2024/wordml/sdtformatlock" xmlns:w16se="http://schemas.microsoft.com/office/word/2015/wordml/symex" xmlns:wpg="http://schemas.microsoft.com/office/word/2010/wordprocessingGroup" xmlns:wpi="http://schemas.microsoft.com/office/word/2010/wordprocessingInk" xmlns:wne="http://schemas.microsoft.com/office/word/2006/wordml" xmlns:wps="http://schemas.microsoft.com/office/word/2010/wordprocessingShape" mc:Ignorable="w14 w15 w16se w16cid w16 w16cex w16sdtdh w16sdtfl w16du wp14">
   <w:body>
     <w:p>
       <w:pPr>
         <w:jc w:val="center"/>
         <w:rPr>
-          <w:rFonts w:hint="default"/>
           <w:b/>
           <w:bCs/>
           <w:sz w:val="32"/>
           <w:szCs w:val="32"/>
           <w:u w:val="single"/>
-          <w:lang w:val="en-US"/>
-        </w:rPr>
-      </w:pPr>
-      <w:r>
-        <w:rPr>
-          <w:rFonts w:hint="default"/>
+        </w:rPr>
+      </w:pPr>
+      <w:r>
+        <w:rPr>
           <w:b/>
           <w:bCs/>
           <w:sz w:val="32"/>
           <w:szCs w:val="32"/>
           <w:u w:val="single"/>
-          <w:lang w:val="en-US"/>
         </w:rPr>
         <w:t>RootMe_Solution_Documentation</w:t>
       </w:r>
@@ -32,24 +28,20 @@
       <w:pPr>
         <w:jc w:val="center"/>
         <w:rPr>
-          <w:rFonts w:hint="default"/>
           <w:b/>
           <w:bCs/>
           <w:sz w:val="28"/>
           <w:szCs w:val="28"/>
           <w:u w:val="single"/>
-          <w:lang w:val="en-US"/>
-        </w:rPr>
-      </w:pPr>
-      <w:r>
-        <w:rPr>
-          <w:rFonts w:hint="default"/>
+        </w:rPr>
+      </w:pPr>
+      <w:r>
+        <w:rPr>
           <w:b/>
           <w:bCs/>
           <w:sz w:val="28"/>
           <w:szCs w:val="28"/>
           <w:u w:val="single"/>
-          <w:lang w:val="en-US"/>
         </w:rPr>
         <w:t>Written by: Yuval Quina</w:t>
       </w:r>
@@ -57,28 +49,22 @@
     <w:p>
       <w:pPr>
         <w:rPr>
-          <w:rFonts w:hint="default"/>
-          <w:sz w:val="24"/>
-          <w:szCs w:val="24"/>
-          <w:lang w:val="en-US"/>
-        </w:rPr>
-      </w:pPr>
-    </w:p>
-    <w:p>
-      <w:pPr>
-        <w:rPr>
-          <w:rFonts w:hint="default"/>
-          <w:sz w:val="24"/>
-          <w:szCs w:val="24"/>
-          <w:lang w:val="en-US"/>
-        </w:rPr>
-      </w:pPr>
-      <w:r>
-        <w:rPr>
-          <w:rFonts w:hint="default"/>
-          <w:sz w:val="24"/>
-          <w:szCs w:val="24"/>
-          <w:lang w:val="en-US"/>
+          <w:sz w:val="24"/>
+          <w:szCs w:val="24"/>
+        </w:rPr>
+      </w:pPr>
+    </w:p>
+    <w:p>
+      <w:pPr>
+        <w:rPr>
+          <w:sz w:val="24"/>
+          <w:szCs w:val="24"/>
+        </w:rPr>
+      </w:pPr>
+      <w:r>
+        <w:rPr>
+          <w:sz w:val="24"/>
+          <w:szCs w:val="24"/>
         </w:rPr>
         <w:t>I started this ctf by performing an Nmap scan:</w:t>
       </w:r>
@@ -92,11 +78,12 @@
       </w:pPr>
       <w:r>
         <w:rPr>
+          <w:noProof/>
           <w:sz w:val="24"/>
           <w:szCs w:val="24"/>
         </w:rPr>
         <w:drawing>
-          <wp:inline distT="0" distB="0" distL="114300" distR="114300">
+          <wp:inline distT="0" distB="0" distL="114300" distR="114300" wp14:anchorId="2F26A093" wp14:editId="77EB02E3">
             <wp:extent cx="4959350" cy="2482850"/>
             <wp:effectExtent l="0" t="0" r="6350" b="6350"/>
             <wp:docPr id="1" name="Picture 1"/>
@@ -141,18 +128,14 @@
     <w:p>
       <w:pPr>
         <w:rPr>
-          <w:rFonts w:hint="default"/>
-          <w:sz w:val="24"/>
-          <w:szCs w:val="24"/>
-          <w:lang w:val="en-US"/>
-        </w:rPr>
-      </w:pPr>
-      <w:r>
-        <w:rPr>
-          <w:rFonts w:hint="default"/>
-          <w:sz w:val="24"/>
-          <w:szCs w:val="24"/>
-          <w:lang w:val="en-US"/>
+          <w:sz w:val="24"/>
+          <w:szCs w:val="24"/>
+        </w:rPr>
+      </w:pPr>
+      <w:r>
+        <w:rPr>
+          <w:sz w:val="24"/>
+          <w:szCs w:val="24"/>
         </w:rPr>
         <w:t>Then, I entered the target’s website:</w:t>
       </w:r>
@@ -166,11 +149,12 @@
       </w:pPr>
       <w:r>
         <w:rPr>
+          <w:noProof/>
           <w:sz w:val="24"/>
           <w:szCs w:val="24"/>
         </w:rPr>
         <w:drawing>
-          <wp:inline distT="0" distB="0" distL="114300" distR="114300">
+          <wp:inline distT="0" distB="0" distL="114300" distR="114300" wp14:anchorId="0DDAB65A" wp14:editId="1A926627">
             <wp:extent cx="2895600" cy="2425065"/>
             <wp:effectExtent l="0" t="0" r="0" b="635"/>
             <wp:docPr id="2" name="Picture 2"/>
@@ -215,18 +199,14 @@
     <w:p>
       <w:pPr>
         <w:rPr>
-          <w:rFonts w:hint="default"/>
-          <w:sz w:val="24"/>
-          <w:szCs w:val="24"/>
-          <w:lang w:val="en-US"/>
-        </w:rPr>
-      </w:pPr>
-      <w:r>
-        <w:rPr>
-          <w:rFonts w:hint="default"/>
-          <w:sz w:val="24"/>
-          <w:szCs w:val="24"/>
-          <w:lang w:val="en-US"/>
+          <w:sz w:val="24"/>
+          <w:szCs w:val="24"/>
+        </w:rPr>
+      </w:pPr>
+      <w:r>
+        <w:rPr>
+          <w:sz w:val="24"/>
+          <w:szCs w:val="24"/>
         </w:rPr>
         <w:t>I opened the inspector and found nothing. Then, I enumerated directories using gobuster:</w:t>
       </w:r>
@@ -240,11 +220,12 @@
       </w:pPr>
       <w:r>
         <w:rPr>
+          <w:noProof/>
           <w:sz w:val="24"/>
           <w:szCs w:val="24"/>
         </w:rPr>
         <w:drawing>
-          <wp:inline distT="0" distB="0" distL="114300" distR="114300">
+          <wp:inline distT="0" distB="0" distL="114300" distR="114300" wp14:anchorId="7D659645" wp14:editId="3D42C66F">
             <wp:extent cx="3626485" cy="2425700"/>
             <wp:effectExtent l="0" t="0" r="5715" b="0"/>
             <wp:docPr id="3" name="Picture 3"/>
@@ -289,19 +270,16 @@
     <w:p>
       <w:pPr>
         <w:rPr>
-          <w:rFonts w:hint="default"/>
-          <w:sz w:val="24"/>
-          <w:szCs w:val="24"/>
-          <w:lang w:val="en-US"/>
-        </w:rPr>
-      </w:pPr>
-      <w:r>
-        <w:rPr>
-          <w:rFonts w:hint="default"/>
-          <w:sz w:val="24"/>
-          <w:szCs w:val="24"/>
-          <w:lang w:val="en-US"/>
-        </w:rPr>
+          <w:sz w:val="24"/>
+          <w:szCs w:val="24"/>
+        </w:rPr>
+      </w:pPr>
+      <w:r>
+        <w:rPr>
+          <w:sz w:val="24"/>
+          <w:szCs w:val="24"/>
+        </w:rPr>
+        <w:lastRenderedPageBreak/>
         <w:t>I tried the /panel:</w:t>
       </w:r>
     </w:p>
@@ -314,11 +292,12 @@
       </w:pPr>
       <w:r>
         <w:rPr>
+          <w:noProof/>
           <w:sz w:val="24"/>
           <w:szCs w:val="24"/>
         </w:rPr>
         <w:drawing>
-          <wp:inline distT="0" distB="0" distL="114300" distR="114300">
+          <wp:inline distT="0" distB="0" distL="114300" distR="114300" wp14:anchorId="45C3636B" wp14:editId="73C9EA91">
             <wp:extent cx="2990850" cy="5168900"/>
             <wp:effectExtent l="0" t="0" r="6350" b="0"/>
             <wp:docPr id="4" name="Picture 4"/>
@@ -363,26 +342,33 @@
     <w:p>
       <w:pPr>
         <w:rPr>
-          <w:rFonts w:hint="default"/>
-          <w:sz w:val="24"/>
-          <w:szCs w:val="24"/>
-          <w:lang w:val="en-US"/>
-        </w:rPr>
-      </w:pPr>
-      <w:r>
-        <w:rPr>
-          <w:rFonts w:hint="default"/>
-          <w:sz w:val="24"/>
-          <w:szCs w:val="24"/>
-          <w:lang w:val="en-US"/>
+          <w:sz w:val="24"/>
+          <w:szCs w:val="24"/>
+        </w:rPr>
+      </w:pPr>
+      <w:r>
+        <w:rPr>
+          <w:sz w:val="24"/>
+          <w:szCs w:val="24"/>
         </w:rPr>
         <w:t>I saw here an upload page. I concluded that it probably possible to upload some malicious files here that can allow me to get a rev shell over the target. I wrote this .php file and tried to upload it:</w:t>
       </w:r>
     </w:p>
     <w:p>
-      <w:r>
+      <w:pPr>
+        <w:rPr>
+          <w:sz w:val="24"/>
+          <w:szCs w:val="24"/>
+        </w:rPr>
+      </w:pPr>
+      <w:r>
+        <w:rPr>
+          <w:noProof/>
+          <w:sz w:val="24"/>
+          <w:szCs w:val="24"/>
+        </w:rPr>
         <w:drawing>
-          <wp:inline distT="0" distB="0" distL="114300" distR="114300">
+          <wp:inline distT="0" distB="0" distL="114300" distR="114300" wp14:anchorId="2438AFB1" wp14:editId="2DB8EC3F">
             <wp:extent cx="3168650" cy="654050"/>
             <wp:effectExtent l="0" t="0" r="6350" b="6350"/>
             <wp:docPr id="5" name="Picture 5"/>
@@ -427,22 +413,33 @@
     <w:p>
       <w:pPr>
         <w:rPr>
-          <w:rFonts w:hint="default"/>
-          <w:lang w:val="en-US"/>
-        </w:rPr>
-      </w:pPr>
-      <w:r>
-        <w:rPr>
-          <w:rFonts w:hint="default"/>
-          <w:lang w:val="en-US"/>
+          <w:sz w:val="24"/>
+          <w:szCs w:val="24"/>
+        </w:rPr>
+      </w:pPr>
+      <w:r>
+        <w:rPr>
+          <w:sz w:val="24"/>
+          <w:szCs w:val="24"/>
         </w:rPr>
         <w:t>But I faced with this error message:</w:t>
       </w:r>
     </w:p>
     <w:p>
-      <w:r>
+      <w:pPr>
+        <w:rPr>
+          <w:sz w:val="24"/>
+          <w:szCs w:val="24"/>
+        </w:rPr>
+      </w:pPr>
+      <w:r>
+        <w:rPr>
+          <w:noProof/>
+          <w:sz w:val="24"/>
+          <w:szCs w:val="24"/>
+        </w:rPr>
         <w:drawing>
-          <wp:inline distT="0" distB="0" distL="114300" distR="114300">
+          <wp:inline distT="0" distB="0" distL="114300" distR="114300" wp14:anchorId="2A4C09A6" wp14:editId="421AFA33">
             <wp:extent cx="1917700" cy="1986280"/>
             <wp:effectExtent l="0" t="0" r="0" b="7620"/>
             <wp:docPr id="6" name="Picture 6"/>
@@ -487,37 +484,49 @@
     <w:p>
       <w:pPr>
         <w:rPr>
-          <w:rFonts w:hint="default"/>
-          <w:lang w:val="en-US"/>
-        </w:rPr>
-      </w:pPr>
-      <w:r>
-        <w:rPr>
-          <w:rFonts w:hint="default"/>
-          <w:lang w:val="en-US"/>
-        </w:rPr>
+          <w:sz w:val="24"/>
+          <w:szCs w:val="24"/>
+        </w:rPr>
+      </w:pPr>
+      <w:r>
+        <w:rPr>
+          <w:sz w:val="24"/>
+          <w:szCs w:val="24"/>
+        </w:rPr>
+        <w:lastRenderedPageBreak/>
         <w:t>At this point, I started investigating ways to upload this file despite the forbidden extension.</w:t>
       </w:r>
     </w:p>
     <w:p>
       <w:pPr>
         <w:rPr>
-          <w:rFonts w:hint="default"/>
-          <w:lang w:val="en-US"/>
-        </w:rPr>
-      </w:pPr>
-      <w:r>
-        <w:rPr>
-          <w:rFonts w:hint="default"/>
-          <w:lang w:val="en-US"/>
+          <w:sz w:val="24"/>
+          <w:szCs w:val="24"/>
+        </w:rPr>
+      </w:pPr>
+      <w:r>
+        <w:rPr>
+          <w:sz w:val="24"/>
+          <w:szCs w:val="24"/>
         </w:rPr>
         <w:t>I thought to maybe change the extension from .php to .php5. This solution actually worked the and the file successfully uploaded:</w:t>
       </w:r>
     </w:p>
     <w:p>
-      <w:r>
+      <w:pPr>
+        <w:rPr>
+          <w:sz w:val="24"/>
+          <w:szCs w:val="24"/>
+        </w:rPr>
+      </w:pPr>
+      <w:r>
+        <w:rPr>
+          <w:noProof/>
+          <w:sz w:val="24"/>
+          <w:szCs w:val="24"/>
+        </w:rPr>
         <w:drawing>
-          <wp:inline distT="0" distB="0" distL="114300" distR="114300">
+          <wp:inline distT="0" distB="0" distL="114300" distR="114300" wp14:anchorId="1FFD48A7" wp14:editId="52D8E524">
             <wp:extent cx="1996440" cy="2012950"/>
             <wp:effectExtent l="0" t="0" r="10160" b="6350"/>
             <wp:docPr id="7" name="Picture 7"/>
@@ -562,22 +571,33 @@
     <w:p>
       <w:pPr>
         <w:rPr>
-          <w:rFonts w:hint="default"/>
-          <w:lang w:val="en-US"/>
-        </w:rPr>
-      </w:pPr>
-      <w:r>
-        <w:rPr>
-          <w:rFonts w:hint="default"/>
-          <w:lang w:val="en-US"/>
+          <w:sz w:val="24"/>
+          <w:szCs w:val="24"/>
+        </w:rPr>
+      </w:pPr>
+      <w:r>
+        <w:rPr>
+          <w:sz w:val="24"/>
+          <w:szCs w:val="24"/>
         </w:rPr>
         <w:t>In order to run the file I entered the /uploads directory and clicked on the file:</w:t>
       </w:r>
     </w:p>
     <w:p>
-      <w:r>
+      <w:pPr>
+        <w:rPr>
+          <w:sz w:val="24"/>
+          <w:szCs w:val="24"/>
+        </w:rPr>
+      </w:pPr>
+      <w:r>
+        <w:rPr>
+          <w:noProof/>
+          <w:sz w:val="24"/>
+          <w:szCs w:val="24"/>
+        </w:rPr>
         <w:drawing>
-          <wp:inline distT="0" distB="0" distL="114300" distR="114300">
+          <wp:inline distT="0" distB="0" distL="114300" distR="114300" wp14:anchorId="65DB71F0" wp14:editId="2EAEF88D">
             <wp:extent cx="3416300" cy="2057400"/>
             <wp:effectExtent l="0" t="0" r="0" b="0"/>
             <wp:docPr id="8" name="Picture 8"/>
@@ -622,22 +642,33 @@
     <w:p>
       <w:pPr>
         <w:rPr>
-          <w:rFonts w:hint="default"/>
-          <w:lang w:val="en-US"/>
-        </w:rPr>
-      </w:pPr>
-      <w:r>
-        <w:rPr>
-          <w:rFonts w:hint="default"/>
-          <w:lang w:val="en-US"/>
+          <w:sz w:val="24"/>
+          <w:szCs w:val="24"/>
+        </w:rPr>
+      </w:pPr>
+      <w:r>
+        <w:rPr>
+          <w:sz w:val="24"/>
+          <w:szCs w:val="24"/>
         </w:rPr>
         <w:t>And fortunately, I got reverse shell over the target:</w:t>
       </w:r>
     </w:p>
     <w:p>
-      <w:r>
+      <w:pPr>
+        <w:rPr>
+          <w:sz w:val="24"/>
+          <w:szCs w:val="24"/>
+        </w:rPr>
+      </w:pPr>
+      <w:r>
+        <w:rPr>
+          <w:noProof/>
+          <w:sz w:val="24"/>
+          <w:szCs w:val="24"/>
+        </w:rPr>
         <w:drawing>
-          <wp:inline distT="0" distB="0" distL="114300" distR="114300">
+          <wp:inline distT="0" distB="0" distL="114300" distR="114300" wp14:anchorId="09821670" wp14:editId="5EA378AA">
             <wp:extent cx="4159250" cy="901700"/>
             <wp:effectExtent l="0" t="0" r="6350" b="0"/>
             <wp:docPr id="9" name="Picture 9"/>
@@ -682,324 +713,640 @@
     <w:p>
       <w:pPr>
         <w:rPr>
-          <w:rFonts w:hint="default"/>
-          <w:lang w:val="en-US"/>
-        </w:rPr>
-      </w:pPr>
-      <w:r>
-        <w:rPr>
-          <w:rFonts w:hint="default"/>
-          <w:lang w:val="en-US"/>
-        </w:rPr>
-        <w:t>* Notice: I run the command “nc -lvnp 4444” before running the rev_shell.php5 file so my machine will listen to the reverse shell request.</w:t>
-      </w:r>
-      <w:bookmarkStart w:id="0" w:name="_GoBack"/>
-      <w:bookmarkEnd w:id="0"/>
-      <w:r>
-        <w:rPr>
-          <w:rFonts w:hint="default"/>
-          <w:lang w:val="en-US"/>
-        </w:rPr>
-        <w:t>”</w:t>
-      </w:r>
-    </w:p>
-    <w:p>
-      <w:pPr>
-        <w:rPr>
-          <w:rFonts w:hint="default"/>
-          <w:lang w:val="en-US"/>
-        </w:rPr>
-      </w:pPr>
+          <w:sz w:val="24"/>
+          <w:szCs w:val="24"/>
+        </w:rPr>
+      </w:pPr>
+      <w:r>
+        <w:rPr>
+          <w:sz w:val="24"/>
+          <w:szCs w:val="24"/>
+        </w:rPr>
+        <w:t>* Notice: I run the command “nc -lvnp 4444” before running the rev_shell.php5 file so my machine will listen to the reverse shell request.”</w:t>
+      </w:r>
+    </w:p>
+    <w:p/>
+    <w:p>
+      <w:pPr>
+        <w:rPr>
+          <w:sz w:val="24"/>
+          <w:szCs w:val="24"/>
+        </w:rPr>
+      </w:pPr>
+      <w:r>
+        <w:rPr>
+          <w:sz w:val="24"/>
+          <w:szCs w:val="24"/>
+        </w:rPr>
+        <w:t>Then, I found the user.txt file on the “/var/www/” directory:</w:t>
+      </w:r>
+    </w:p>
+    <w:p>
+      <w:pPr>
+        <w:rPr>
+          <w:sz w:val="24"/>
+          <w:szCs w:val="24"/>
+        </w:rPr>
+      </w:pPr>
+      <w:r>
+        <w:rPr>
+          <w:noProof/>
+          <w:sz w:val="24"/>
+          <w:szCs w:val="24"/>
+        </w:rPr>
+        <w:drawing>
+          <wp:inline distT="0" distB="0" distL="0" distR="0" wp14:anchorId="598C3835" wp14:editId="73554209">
+            <wp:extent cx="2705334" cy="369602"/>
+            <wp:effectExtent l="0" t="0" r="0" b="0"/>
+            <wp:docPr id="2004520585" name="תמונה 1"/>
+            <wp:cNvGraphicFramePr>
+              <a:graphicFrameLocks xmlns:a="http://schemas.openxmlformats.org/drawingml/2006/main" noChangeAspect="1"/>
+            </wp:cNvGraphicFramePr>
+            <a:graphic xmlns:a="http://schemas.openxmlformats.org/drawingml/2006/main">
+              <a:graphicData uri="http://schemas.openxmlformats.org/drawingml/2006/picture">
+                <pic:pic xmlns:pic="http://schemas.openxmlformats.org/drawingml/2006/picture">
+                  <pic:nvPicPr>
+                    <pic:cNvPr id="2004520585" name=""/>
+                    <pic:cNvPicPr/>
+                  </pic:nvPicPr>
+                  <pic:blipFill>
+                    <a:blip r:embed="rId13"/>
+                    <a:stretch>
+                      <a:fillRect/>
+                    </a:stretch>
+                  </pic:blipFill>
+                  <pic:spPr>
+                    <a:xfrm>
+                      <a:off x="0" y="0"/>
+                      <a:ext cx="2705334" cy="369602"/>
+                    </a:xfrm>
+                    <a:prstGeom prst="rect">
+                      <a:avLst/>
+                    </a:prstGeom>
+                  </pic:spPr>
+                </pic:pic>
+              </a:graphicData>
+            </a:graphic>
+          </wp:inline>
+        </w:drawing>
+      </w:r>
+    </w:p>
+    <w:p>
+      <w:pPr>
+        <w:rPr>
+          <w:sz w:val="24"/>
+          <w:szCs w:val="24"/>
+        </w:rPr>
+      </w:pPr>
+      <w:r>
+        <w:rPr>
+          <w:sz w:val="24"/>
+          <w:szCs w:val="24"/>
+        </w:rPr>
+        <w:t xml:space="preserve">Afterwards, I aimed to escalate my privileges to </w:t>
+      </w:r>
+      <w:r>
+        <w:rPr>
+          <w:sz w:val="24"/>
+          <w:szCs w:val="24"/>
+        </w:rPr>
+        <w:t>root user.</w:t>
+      </w:r>
+      <w:r>
+        <w:rPr>
+          <w:sz w:val="24"/>
+          <w:szCs w:val="24"/>
+        </w:rPr>
+        <w:t xml:space="preserve"> I found that I the SUID binary: “/usr/bin/python” which I could use to </w:t>
+      </w:r>
+      <w:r>
+        <w:rPr>
+          <w:sz w:val="24"/>
+          <w:szCs w:val="24"/>
+        </w:rPr>
+        <w:t>execute this python command:</w:t>
+      </w:r>
+    </w:p>
+    <w:p>
+      <w:pPr>
+        <w:rPr>
+          <w:sz w:val="24"/>
+          <w:szCs w:val="24"/>
+        </w:rPr>
+      </w:pPr>
+      <w:r>
+        <w:rPr>
+          <w:sz w:val="24"/>
+          <w:szCs w:val="24"/>
+        </w:rPr>
+        <w:drawing>
+          <wp:inline distT="0" distB="0" distL="0" distR="0" wp14:anchorId="27A3CA0D" wp14:editId="518B1589">
+            <wp:extent cx="3600762" cy="171465"/>
+            <wp:effectExtent l="0" t="0" r="0" b="0"/>
+            <wp:docPr id="1422374298" name="תמונה 1"/>
+            <wp:cNvGraphicFramePr>
+              <a:graphicFrameLocks xmlns:a="http://schemas.openxmlformats.org/drawingml/2006/main" noChangeAspect="1"/>
+            </wp:cNvGraphicFramePr>
+            <a:graphic xmlns:a="http://schemas.openxmlformats.org/drawingml/2006/main">
+              <a:graphicData uri="http://schemas.openxmlformats.org/drawingml/2006/picture">
+                <pic:pic xmlns:pic="http://schemas.openxmlformats.org/drawingml/2006/picture">
+                  <pic:nvPicPr>
+                    <pic:cNvPr id="1422374298" name=""/>
+                    <pic:cNvPicPr/>
+                  </pic:nvPicPr>
+                  <pic:blipFill>
+                    <a:blip r:embed="rId14"/>
+                    <a:stretch>
+                      <a:fillRect/>
+                    </a:stretch>
+                  </pic:blipFill>
+                  <pic:spPr>
+                    <a:xfrm>
+                      <a:off x="0" y="0"/>
+                      <a:ext cx="3600762" cy="171465"/>
+                    </a:xfrm>
+                    <a:prstGeom prst="rect">
+                      <a:avLst/>
+                    </a:prstGeom>
+                  </pic:spPr>
+                </pic:pic>
+              </a:graphicData>
+            </a:graphic>
+          </wp:inline>
+        </w:drawing>
+      </w:r>
+    </w:p>
+    <w:p>
+      <w:pPr>
+        <w:rPr>
+          <w:sz w:val="24"/>
+          <w:szCs w:val="24"/>
+        </w:rPr>
+      </w:pPr>
+      <w:r>
+        <w:rPr>
+          <w:sz w:val="24"/>
+          <w:szCs w:val="24"/>
+        </w:rPr>
+        <w:t>And I got root privileges:</w:t>
+      </w:r>
+    </w:p>
+    <w:p>
+      <w:pPr>
+        <w:rPr>
+          <w:sz w:val="24"/>
+          <w:szCs w:val="24"/>
+        </w:rPr>
+      </w:pPr>
+      <w:r>
+        <w:rPr>
+          <w:sz w:val="24"/>
+          <w:szCs w:val="24"/>
+        </w:rPr>
+        <w:drawing>
+          <wp:inline distT="0" distB="0" distL="0" distR="0" wp14:anchorId="6F0F2097" wp14:editId="326223D6">
+            <wp:extent cx="533446" cy="400085"/>
+            <wp:effectExtent l="0" t="0" r="0" b="0"/>
+            <wp:docPr id="1047912841" name="תמונה 1"/>
+            <wp:cNvGraphicFramePr>
+              <a:graphicFrameLocks xmlns:a="http://schemas.openxmlformats.org/drawingml/2006/main" noChangeAspect="1"/>
+            </wp:cNvGraphicFramePr>
+            <a:graphic xmlns:a="http://schemas.openxmlformats.org/drawingml/2006/main">
+              <a:graphicData uri="http://schemas.openxmlformats.org/drawingml/2006/picture">
+                <pic:pic xmlns:pic="http://schemas.openxmlformats.org/drawingml/2006/picture">
+                  <pic:nvPicPr>
+                    <pic:cNvPr id="1047912841" name=""/>
+                    <pic:cNvPicPr/>
+                  </pic:nvPicPr>
+                  <pic:blipFill>
+                    <a:blip r:embed="rId15"/>
+                    <a:stretch>
+                      <a:fillRect/>
+                    </a:stretch>
+                  </pic:blipFill>
+                  <pic:spPr>
+                    <a:xfrm>
+                      <a:off x="0" y="0"/>
+                      <a:ext cx="533446" cy="400085"/>
+                    </a:xfrm>
+                    <a:prstGeom prst="rect">
+                      <a:avLst/>
+                    </a:prstGeom>
+                  </pic:spPr>
+                </pic:pic>
+              </a:graphicData>
+            </a:graphic>
+          </wp:inline>
+        </w:drawing>
+      </w:r>
+    </w:p>
+    <w:p>
+      <w:pPr>
+        <w:rPr>
+          <w:sz w:val="24"/>
+          <w:szCs w:val="24"/>
+        </w:rPr>
+      </w:pPr>
+      <w:r>
+        <w:rPr>
+          <w:sz w:val="24"/>
+          <w:szCs w:val="24"/>
+        </w:rPr>
+        <w:t xml:space="preserve">Now, </w:t>
+      </w:r>
+      <w:r>
+        <w:rPr>
+          <w:sz w:val="24"/>
+          <w:szCs w:val="24"/>
+        </w:rPr>
+        <w:t>I</w:t>
+      </w:r>
+      <w:r>
+        <w:rPr>
+          <w:sz w:val="24"/>
+          <w:szCs w:val="24"/>
+        </w:rPr>
+        <w:t xml:space="preserve"> can access and read the root.txt:</w:t>
+      </w:r>
+    </w:p>
+    <w:p>
+      <w:pPr>
+        <w:rPr>
+          <w:sz w:val="24"/>
+          <w:szCs w:val="24"/>
+        </w:rPr>
+      </w:pPr>
+      <w:r>
+        <w:rPr>
+          <w:sz w:val="24"/>
+          <w:szCs w:val="24"/>
+        </w:rPr>
+        <w:drawing>
+          <wp:inline distT="0" distB="0" distL="0" distR="0" wp14:anchorId="36BC1C69" wp14:editId="3BEC71CB">
+            <wp:extent cx="1333500" cy="321766"/>
+            <wp:effectExtent l="0" t="0" r="0" b="2540"/>
+            <wp:docPr id="308470191" name="תמונה 1"/>
+            <wp:cNvGraphicFramePr>
+              <a:graphicFrameLocks xmlns:a="http://schemas.openxmlformats.org/drawingml/2006/main" noChangeAspect="1"/>
+            </wp:cNvGraphicFramePr>
+            <a:graphic xmlns:a="http://schemas.openxmlformats.org/drawingml/2006/main">
+              <a:graphicData uri="http://schemas.openxmlformats.org/drawingml/2006/picture">
+                <pic:pic xmlns:pic="http://schemas.openxmlformats.org/drawingml/2006/picture">
+                  <pic:nvPicPr>
+                    <pic:cNvPr id="308470191" name=""/>
+                    <pic:cNvPicPr/>
+                  </pic:nvPicPr>
+                  <pic:blipFill>
+                    <a:blip r:embed="rId16"/>
+                    <a:stretch>
+                      <a:fillRect/>
+                    </a:stretch>
+                  </pic:blipFill>
+                  <pic:spPr>
+                    <a:xfrm>
+                      <a:off x="0" y="0"/>
+                      <a:ext cx="1358111" cy="327704"/>
+                    </a:xfrm>
+                    <a:prstGeom prst="rect">
+                      <a:avLst/>
+                    </a:prstGeom>
+                  </pic:spPr>
+                </pic:pic>
+              </a:graphicData>
+            </a:graphic>
+          </wp:inline>
+        </w:drawing>
+      </w:r>
     </w:p>
     <w:sectPr>
       <w:pgSz w:w="11906" w:h="16838"/>
       <w:pgMar w:top="1440" w:right="1800" w:bottom="1440" w:left="1800" w:header="720" w:footer="720" w:gutter="0"/>
-      <w:cols w:space="720" w:num="1"/>
-      <w:docGrid w:linePitch="360" w:charSpace="0"/>
+      <w:cols w:space="720"/>
+      <w:docGrid w:linePitch="360"/>
     </w:sectPr>
   </w:body>
 </w:document>
 </file>
 
 <file path=word/styles.xml><?xml version="1.0" encoding="utf-8"?>
-<w:styles xmlns:mc="http://schemas.openxmlformats.org/markup-compatibility/2006" xmlns:o="urn:schemas-microsoft-com:office:office" xmlns:r="http://schemas.openxmlformats.org/officeDocument/2006/relationships" xmlns:m="http://schemas.openxmlformats.org/officeDocument/2006/math" xmlns:v="urn:schemas-microsoft-com:vml" xmlns:w="http://schemas.openxmlformats.org/wordprocessingml/2006/main" xmlns:w14="http://schemas.microsoft.com/office/word/2010/wordml" xmlns:w10="urn:schemas-microsoft-com:office:word" xmlns:sl="http://schemas.openxmlformats.org/schemaLibrary/2006/main" xmlns:wpsCustomData="http://www.wps.cn/officeDocument/2013/wpsCustomData" mc:Ignorable="w14">
+<w:styles xmlns:mc="http://schemas.openxmlformats.org/markup-compatibility/2006" xmlns:r="http://schemas.openxmlformats.org/officeDocument/2006/relationships" xmlns:w="http://schemas.openxmlformats.org/wordprocessingml/2006/main" xmlns:w14="http://schemas.microsoft.com/office/word/2010/wordml" xmlns:w15="http://schemas.microsoft.com/office/word/2012/wordml" xmlns:w16cex="http://schemas.microsoft.com/office/word/2018/wordml/cex" xmlns:w16cid="http://schemas.microsoft.com/office/word/2016/wordml/cid" xmlns:w16="http://schemas.microsoft.com/office/word/2018/wordml" xmlns:w16du="http://schemas.microsoft.com/office/word/2023/wordml/word16du" xmlns:w16sdtdh="http://schemas.microsoft.com/office/word/2020/wordml/sdtdatahash" xmlns:w16sdtfl="http://schemas.microsoft.com/office/word/2024/wordml/sdtformatlock" xmlns:w16se="http://schemas.microsoft.com/office/word/2015/wordml/symex" mc:Ignorable="w14 w15 w16se w16cid w16 w16cex w16sdtdh w16sdtfl w16du">
   <w:docDefaults>
     <w:rPrDefault>
       <w:rPr>
-        <w:rFonts w:asciiTheme="minorHAnsi" w:hAnsiTheme="minorHAnsi" w:eastAsiaTheme="minorEastAsia" w:cstheme="minorBidi"/>
+        <w:rFonts w:asciiTheme="minorHAnsi" w:eastAsiaTheme="minorEastAsia" w:hAnsiTheme="minorHAnsi" w:cstheme="minorBidi"/>
+        <w:lang w:val="en-US" w:eastAsia="en-US" w:bidi="he-IL"/>
       </w:rPr>
     </w:rPrDefault>
     <w:pPrDefault/>
   </w:docDefaults>
-  <w:latentStyles w:count="260" w:defQFormat="0" w:defUnhideWhenUsed="1" w:defSemiHidden="1" w:defUIPriority="99" w:defLockedState="0">
-    <w:lsdException w:qFormat="1" w:unhideWhenUsed="0" w:uiPriority="0" w:semiHidden="0" w:name="Normal"/>
-    <w:lsdException w:qFormat="1" w:unhideWhenUsed="0" w:uiPriority="0" w:semiHidden="0" w:name="heading 1"/>
-    <w:lsdException w:qFormat="1" w:uiPriority="0" w:name="heading 2"/>
-    <w:lsdException w:qFormat="1" w:uiPriority="0" w:name="heading 3"/>
-    <w:lsdException w:qFormat="1" w:uiPriority="0" w:name="heading 4"/>
-    <w:lsdException w:qFormat="1" w:uiPriority="0" w:name="heading 5"/>
-    <w:lsdException w:qFormat="1" w:uiPriority="0" w:name="heading 6"/>
-    <w:lsdException w:qFormat="1" w:uiPriority="0" w:name="heading 7"/>
-    <w:lsdException w:qFormat="1" w:uiPriority="0" w:name="heading 8"/>
-    <w:lsdException w:qFormat="1" w:uiPriority="0" w:name="heading 9"/>
-    <w:lsdException w:unhideWhenUsed="0" w:uiPriority="0" w:semiHidden="0" w:name="index 1"/>
-    <w:lsdException w:unhideWhenUsed="0" w:uiPriority="0" w:semiHidden="0" w:name="index 2"/>
-    <w:lsdException w:unhideWhenUsed="0" w:uiPriority="0" w:semiHidden="0" w:name="index 3"/>
-    <w:lsdException w:unhideWhenUsed="0" w:uiPriority="0" w:semiHidden="0" w:name="index 4"/>
-    <w:lsdException w:unhideWhenUsed="0" w:uiPriority="0" w:semiHidden="0" w:name="index 5"/>
-    <w:lsdException w:unhideWhenUsed="0" w:uiPriority="0" w:semiHidden="0" w:name="index 6"/>
-    <w:lsdException w:unhideWhenUsed="0" w:uiPriority="0" w:semiHidden="0" w:name="index 7"/>
-    <w:lsdException w:unhideWhenUsed="0" w:uiPriority="0" w:semiHidden="0" w:name="index 8"/>
-    <w:lsdException w:unhideWhenUsed="0" w:uiPriority="0" w:semiHidden="0" w:name="index 9"/>
-    <w:lsdException w:unhideWhenUsed="0" w:uiPriority="0" w:semiHidden="0" w:name="toc 1"/>
-    <w:lsdException w:unhideWhenUsed="0" w:uiPriority="0" w:semiHidden="0" w:name="toc 2"/>
-    <w:lsdException w:unhideWhenUsed="0" w:uiPriority="0" w:semiHidden="0" w:name="toc 3"/>
-    <w:lsdException w:unhideWhenUsed="0" w:uiPriority="0" w:semiHidden="0" w:name="toc 4"/>
-    <w:lsdException w:unhideWhenUsed="0" w:uiPriority="0" w:semiHidden="0" w:name="toc 5"/>
-    <w:lsdException w:unhideWhenUsed="0" w:uiPriority="0" w:semiHidden="0" w:name="toc 6"/>
-    <w:lsdException w:unhideWhenUsed="0" w:uiPriority="0" w:semiHidden="0" w:name="toc 7"/>
-    <w:lsdException w:unhideWhenUsed="0" w:uiPriority="0" w:semiHidden="0" w:name="toc 8"/>
-    <w:lsdException w:unhideWhenUsed="0" w:uiPriority="0" w:semiHidden="0" w:name="toc 9"/>
-    <w:lsdException w:unhideWhenUsed="0" w:uiPriority="0" w:semiHidden="0" w:name="Normal Indent"/>
-    <w:lsdException w:unhideWhenUsed="0" w:uiPriority="0" w:semiHidden="0" w:name="footnote text"/>
-    <w:lsdException w:unhideWhenUsed="0" w:uiPriority="0" w:semiHidden="0" w:name="annotation text"/>
-    <w:lsdException w:unhideWhenUsed="0" w:uiPriority="0" w:semiHidden="0" w:name="header"/>
-    <w:lsdException w:unhideWhenUsed="0" w:uiPriority="0" w:semiHidden="0" w:name="footer"/>
-    <w:lsdException w:unhideWhenUsed="0" w:uiPriority="0" w:semiHidden="0" w:name="index heading"/>
-    <w:lsdException w:qFormat="1" w:uiPriority="0" w:name="caption"/>
-    <w:lsdException w:unhideWhenUsed="0" w:uiPriority="0" w:semiHidden="0" w:name="table of figures"/>
-    <w:lsdException w:unhideWhenUsed="0" w:uiPriority="0" w:semiHidden="0" w:name="envelope address"/>
-    <w:lsdException w:unhideWhenUsed="0" w:uiPriority="0" w:semiHidden="0" w:name="envelope return"/>
-    <w:lsdException w:unhideWhenUsed="0" w:uiPriority="0" w:semiHidden="0" w:name="footnote reference"/>
-    <w:lsdException w:unhideWhenUsed="0" w:uiPriority="0" w:semiHidden="0" w:name="annotation reference"/>
-    <w:lsdException w:unhideWhenUsed="0" w:uiPriority="0" w:semiHidden="0" w:name="line number"/>
-    <w:lsdException w:unhideWhenUsed="0" w:uiPriority="0" w:semiHidden="0" w:name="page number"/>
-    <w:lsdException w:unhideWhenUsed="0" w:uiPriority="0" w:semiHidden="0" w:name="endnote reference"/>
-    <w:lsdException w:unhideWhenUsed="0" w:uiPriority="0" w:semiHidden="0" w:name="endnote text"/>
-    <w:lsdException w:unhideWhenUsed="0" w:uiPriority="0" w:semiHidden="0" w:name="table of authorities"/>
-    <w:lsdException w:unhideWhenUsed="0" w:uiPriority="0" w:semiHidden="0" w:name="macro"/>
-    <w:lsdException w:unhideWhenUsed="0" w:uiPriority="0" w:semiHidden="0" w:name="toa heading"/>
-    <w:lsdException w:unhideWhenUsed="0" w:uiPriority="0" w:semiHidden="0" w:name="List"/>
-    <w:lsdException w:unhideWhenUsed="0" w:uiPriority="0" w:semiHidden="0" w:name="List Bullet"/>
-    <w:lsdException w:unhideWhenUsed="0" w:uiPriority="0" w:semiHidden="0" w:name="List Number"/>
-    <w:lsdException w:unhideWhenUsed="0" w:uiPriority="0" w:semiHidden="0" w:name="List 2"/>
-    <w:lsdException w:unhideWhenUsed="0" w:uiPriority="0" w:semiHidden="0" w:name="List 3"/>
-    <w:lsdException w:unhideWhenUsed="0" w:uiPriority="0" w:semiHidden="0" w:name="List 4"/>
-    <w:lsdException w:unhideWhenUsed="0" w:uiPriority="0" w:semiHidden="0" w:name="List 5"/>
-    <w:lsdException w:unhideWhenUsed="0" w:uiPriority="0" w:semiHidden="0" w:name="List Bullet 2"/>
-    <w:lsdException w:unhideWhenUsed="0" w:uiPriority="0" w:semiHidden="0" w:name="List Bullet 3"/>
-    <w:lsdException w:unhideWhenUsed="0" w:uiPriority="0" w:semiHidden="0" w:name="List Bullet 4"/>
-    <w:lsdException w:unhideWhenUsed="0" w:uiPriority="0" w:semiHidden="0" w:name="List Bullet 5"/>
-    <w:lsdException w:unhideWhenUsed="0" w:uiPriority="0" w:semiHidden="0" w:name="List Number 2"/>
-    <w:lsdException w:unhideWhenUsed="0" w:uiPriority="0" w:semiHidden="0" w:name="List Number 3"/>
-    <w:lsdException w:unhideWhenUsed="0" w:uiPriority="0" w:semiHidden="0" w:name="List Number 4"/>
-    <w:lsdException w:unhideWhenUsed="0" w:uiPriority="0" w:semiHidden="0" w:name="List Number 5"/>
-    <w:lsdException w:qFormat="1" w:unhideWhenUsed="0" w:uiPriority="0" w:semiHidden="0" w:name="Title"/>
-    <w:lsdException w:unhideWhenUsed="0" w:uiPriority="0" w:semiHidden="0" w:name="Closing"/>
-    <w:lsdException w:unhideWhenUsed="0" w:uiPriority="0" w:semiHidden="0" w:name="Signature"/>
-    <w:lsdException w:unhideWhenUsed="0" w:uiPriority="0" w:name="Default Paragraph Font"/>
-    <w:lsdException w:unhideWhenUsed="0" w:uiPriority="0" w:semiHidden="0" w:name="Body Text"/>
-    <w:lsdException w:unhideWhenUsed="0" w:uiPriority="0" w:semiHidden="0" w:name="Body Text Indent"/>
-    <w:lsdException w:unhideWhenUsed="0" w:uiPriority="0" w:semiHidden="0" w:name="List Continue"/>
-    <w:lsdException w:unhideWhenUsed="0" w:uiPriority="0" w:semiHidden="0" w:name="List Continue 2"/>
-    <w:lsdException w:unhideWhenUsed="0" w:uiPriority="0" w:semiHidden="0" w:name="List Continue 3"/>
-    <w:lsdException w:unhideWhenUsed="0" w:uiPriority="0" w:semiHidden="0" w:name="List Continue 4"/>
-    <w:lsdException w:unhideWhenUsed="0" w:uiPriority="0" w:semiHidden="0" w:name="List Continue 5"/>
-    <w:lsdException w:unhideWhenUsed="0" w:uiPriority="0" w:semiHidden="0" w:name="Message Header"/>
-    <w:lsdException w:qFormat="1" w:unhideWhenUsed="0" w:uiPriority="0" w:semiHidden="0" w:name="Subtitle"/>
-    <w:lsdException w:unhideWhenUsed="0" w:uiPriority="0" w:semiHidden="0" w:name="Salutation"/>
-    <w:lsdException w:unhideWhenUsed="0" w:uiPriority="0" w:semiHidden="0" w:name="Date"/>
-    <w:lsdException w:unhideWhenUsed="0" w:uiPriority="0" w:semiHidden="0" w:name="Body Text First Indent"/>
-    <w:lsdException w:unhideWhenUsed="0" w:uiPriority="0" w:semiHidden="0" w:name="Body Text First Indent 2"/>
-    <w:lsdException w:unhideWhenUsed="0" w:uiPriority="0" w:semiHidden="0" w:name="Note Heading"/>
-    <w:lsdException w:unhideWhenUsed="0" w:uiPriority="0" w:semiHidden="0" w:name="Body Text 2"/>
-    <w:lsdException w:unhideWhenUsed="0" w:uiPriority="0" w:semiHidden="0" w:name="Body Text 3"/>
-    <w:lsdException w:unhideWhenUsed="0" w:uiPriority="0" w:semiHidden="0" w:name="Body Text Indent 2"/>
-    <w:lsdException w:unhideWhenUsed="0" w:uiPriority="0" w:semiHidden="0" w:name="Body Text Indent 3"/>
-    <w:lsdException w:unhideWhenUsed="0" w:uiPriority="0" w:semiHidden="0" w:name="Block Text"/>
-    <w:lsdException w:unhideWhenUsed="0" w:uiPriority="0" w:semiHidden="0" w:name="Hyperlink"/>
-    <w:lsdException w:unhideWhenUsed="0" w:uiPriority="0" w:semiHidden="0" w:name="FollowedHyperlink"/>
-    <w:lsdException w:qFormat="1" w:unhideWhenUsed="0" w:uiPriority="0" w:semiHidden="0" w:name="Strong"/>
-    <w:lsdException w:qFormat="1" w:unhideWhenUsed="0" w:uiPriority="0" w:semiHidden="0" w:name="Emphasis"/>
-    <w:lsdException w:unhideWhenUsed="0" w:uiPriority="0" w:semiHidden="0" w:name="Document Map"/>
-    <w:lsdException w:unhideWhenUsed="0" w:uiPriority="0" w:semiHidden="0" w:name="Plain Text"/>
-    <w:lsdException w:unhideWhenUsed="0" w:uiPriority="0" w:semiHidden="0" w:name="E-mail Signature"/>
-    <w:lsdException w:unhideWhenUsed="0" w:uiPriority="0" w:semiHidden="0" w:name="Normal (Web)"/>
-    <w:lsdException w:unhideWhenUsed="0" w:uiPriority="0" w:semiHidden="0" w:name="HTML Acronym"/>
-    <w:lsdException w:unhideWhenUsed="0" w:uiPriority="0" w:semiHidden="0" w:name="HTML Address"/>
-    <w:lsdException w:unhideWhenUsed="0" w:uiPriority="0" w:semiHidden="0" w:name="HTML Cite"/>
-    <w:lsdException w:unhideWhenUsed="0" w:uiPriority="0" w:semiHidden="0" w:name="HTML Code"/>
-    <w:lsdException w:unhideWhenUsed="0" w:uiPriority="0" w:semiHidden="0" w:name="HTML Definition"/>
-    <w:lsdException w:unhideWhenUsed="0" w:uiPriority="0" w:semiHidden="0" w:name="HTML Keyboard"/>
-    <w:lsdException w:unhideWhenUsed="0" w:uiPriority="0" w:semiHidden="0" w:name="HTML Preformatted"/>
-    <w:lsdException w:unhideWhenUsed="0" w:uiPriority="0" w:semiHidden="0" w:name="HTML Sample"/>
-    <w:lsdException w:unhideWhenUsed="0" w:uiPriority="0" w:semiHidden="0" w:name="HTML Typewriter"/>
-    <w:lsdException w:unhideWhenUsed="0" w:uiPriority="0" w:semiHidden="0" w:name="HTML Variable"/>
-    <w:lsdException w:unhideWhenUsed="0" w:uiPriority="0" w:name="Normal Table"/>
-    <w:lsdException w:unhideWhenUsed="0" w:uiPriority="0" w:semiHidden="0" w:name="annotation subject"/>
-    <w:lsdException w:unhideWhenUsed="0" w:uiPriority="0" w:semiHidden="0" w:name="Table Simple 1"/>
-    <w:lsdException w:unhideWhenUsed="0" w:uiPriority="0" w:semiHidden="0" w:name="Table Simple 2"/>
-    <w:lsdException w:unhideWhenUsed="0" w:uiPriority="0" w:semiHidden="0" w:name="Table Simple 3"/>
-    <w:lsdException w:unhideWhenUsed="0" w:uiPriority="0" w:semiHidden="0" w:name="Table Classic 1"/>
-    <w:lsdException w:unhideWhenUsed="0" w:uiPriority="0" w:semiHidden="0" w:name="Table Classic 2"/>
-    <w:lsdException w:unhideWhenUsed="0" w:uiPriority="0" w:semiHidden="0" w:name="Table Classic 3"/>
-    <w:lsdException w:unhideWhenUsed="0" w:uiPriority="0" w:semiHidden="0" w:name="Table Classic 4"/>
-    <w:lsdException w:unhideWhenUsed="0" w:uiPriority="0" w:semiHidden="0" w:name="Table Colorful 1"/>
-    <w:lsdException w:unhideWhenUsed="0" w:uiPriority="0" w:semiHidden="0" w:name="Table Colorful 2"/>
-    <w:lsdException w:unhideWhenUsed="0" w:uiPriority="0" w:semiHidden="0" w:name="Table Colorful 3"/>
-    <w:lsdException w:unhideWhenUsed="0" w:uiPriority="0" w:semiHidden="0" w:name="Table Columns 1"/>
-    <w:lsdException w:unhideWhenUsed="0" w:uiPriority="0" w:semiHidden="0" w:name="Table Columns 2"/>
-    <w:lsdException w:unhideWhenUsed="0" w:uiPriority="0" w:semiHidden="0" w:name="Table Columns 3"/>
-    <w:lsdException w:unhideWhenUsed="0" w:uiPriority="0" w:semiHidden="0" w:name="Table Columns 4"/>
-    <w:lsdException w:unhideWhenUsed="0" w:uiPriority="0" w:semiHidden="0" w:name="Table Columns 5"/>
-    <w:lsdException w:unhideWhenUsed="0" w:uiPriority="0" w:semiHidden="0" w:name="Table Grid 1"/>
-    <w:lsdException w:unhideWhenUsed="0" w:uiPriority="0" w:semiHidden="0" w:name="Table Grid 2"/>
-    <w:lsdException w:unhideWhenUsed="0" w:uiPriority="0" w:semiHidden="0" w:name="Table Grid 3"/>
-    <w:lsdException w:unhideWhenUsed="0" w:uiPriority="0" w:semiHidden="0" w:name="Table Grid 4"/>
-    <w:lsdException w:unhideWhenUsed="0" w:uiPriority="0" w:semiHidden="0" w:name="Table Grid 5"/>
-    <w:lsdException w:unhideWhenUsed="0" w:uiPriority="0" w:semiHidden="0" w:name="Table Grid 6"/>
-    <w:lsdException w:unhideWhenUsed="0" w:uiPriority="0" w:semiHidden="0" w:name="Table Grid 7"/>
-    <w:lsdException w:unhideWhenUsed="0" w:uiPriority="0" w:semiHidden="0" w:name="Table Grid 8"/>
-    <w:lsdException w:unhideWhenUsed="0" w:uiPriority="0" w:semiHidden="0" w:name="Table List 1"/>
-    <w:lsdException w:unhideWhenUsed="0" w:uiPriority="0" w:semiHidden="0" w:name="Table List 2"/>
-    <w:lsdException w:unhideWhenUsed="0" w:uiPriority="0" w:semiHidden="0" w:name="Table List 3"/>
-    <w:lsdException w:unhideWhenUsed="0" w:uiPriority="0" w:semiHidden="0" w:name="Table List 4"/>
-    <w:lsdException w:unhideWhenUsed="0" w:uiPriority="0" w:semiHidden="0" w:name="Table List 5"/>
-    <w:lsdException w:unhideWhenUsed="0" w:uiPriority="0" w:semiHidden="0" w:name="Table List 6"/>
-    <w:lsdException w:unhideWhenUsed="0" w:uiPriority="0" w:semiHidden="0" w:name="Table List 7"/>
-    <w:lsdException w:unhideWhenUsed="0" w:uiPriority="0" w:semiHidden="0" w:name="Table List 8"/>
-    <w:lsdException w:unhideWhenUsed="0" w:uiPriority="0" w:semiHidden="0" w:name="Table 3D effects 1"/>
-    <w:lsdException w:unhideWhenUsed="0" w:uiPriority="0" w:semiHidden="0" w:name="Table 3D effects 2"/>
-    <w:lsdException w:unhideWhenUsed="0" w:uiPriority="0" w:semiHidden="0" w:name="Table 3D effects 3"/>
-    <w:lsdException w:unhideWhenUsed="0" w:uiPriority="0" w:semiHidden="0" w:name="Table Contemporary"/>
-    <w:lsdException w:unhideWhenUsed="0" w:uiPriority="0" w:semiHidden="0" w:name="Table Elegant"/>
-    <w:lsdException w:unhideWhenUsed="0" w:uiPriority="0" w:semiHidden="0" w:name="Table Professional"/>
-    <w:lsdException w:unhideWhenUsed="0" w:uiPriority="0" w:semiHidden="0" w:name="Table Subtle 1"/>
-    <w:lsdException w:unhideWhenUsed="0" w:uiPriority="0" w:semiHidden="0" w:name="Table Subtle 2"/>
-    <w:lsdException w:unhideWhenUsed="0" w:uiPriority="0" w:semiHidden="0" w:name="Table Web 1"/>
-    <w:lsdException w:unhideWhenUsed="0" w:uiPriority="0" w:semiHidden="0" w:name="Table Web 2"/>
-    <w:lsdException w:unhideWhenUsed="0" w:uiPriority="0" w:semiHidden="0" w:name="Table Web 3"/>
-    <w:lsdException w:unhideWhenUsed="0" w:uiPriority="0" w:semiHidden="0" w:name="Balloon Text"/>
-    <w:lsdException w:unhideWhenUsed="0" w:uiPriority="0" w:semiHidden="0" w:name="Table Grid"/>
-    <w:lsdException w:unhideWhenUsed="0" w:uiPriority="0" w:semiHidden="0" w:name="Table Theme"/>
-    <w:lsdException w:unhideWhenUsed="0" w:uiPriority="60" w:semiHidden="0" w:name="Light Shading"/>
-    <w:lsdException w:unhideWhenUsed="0" w:uiPriority="61" w:semiHidden="0" w:name="Light List"/>
-    <w:lsdException w:unhideWhenUsed="0" w:uiPriority="62" w:semiHidden="0" w:name="Light Grid"/>
-    <w:lsdException w:unhideWhenUsed="0" w:uiPriority="63" w:semiHidden="0" w:name="Medium Shading 1"/>
-    <w:lsdException w:unhideWhenUsed="0" w:uiPriority="64" w:semiHidden="0" w:name="Medium Shading 2"/>
-    <w:lsdException w:unhideWhenUsed="0" w:uiPriority="65" w:semiHidden="0" w:name="Medium List 1"/>
-    <w:lsdException w:unhideWhenUsed="0" w:uiPriority="66" w:semiHidden="0" w:name="Medium List 2"/>
-    <w:lsdException w:unhideWhenUsed="0" w:uiPriority="67" w:semiHidden="0" w:name="Medium Grid 1"/>
-    <w:lsdException w:unhideWhenUsed="0" w:uiPriority="68" w:semiHidden="0" w:name="Medium Grid 2"/>
-    <w:lsdException w:unhideWhenUsed="0" w:uiPriority="69" w:semiHidden="0" w:name="Medium Grid 3"/>
-    <w:lsdException w:unhideWhenUsed="0" w:uiPriority="70" w:semiHidden="0" w:name="Dark List"/>
-    <w:lsdException w:unhideWhenUsed="0" w:uiPriority="71" w:semiHidden="0" w:name="Colorful Shading"/>
-    <w:lsdException w:unhideWhenUsed="0" w:uiPriority="72" w:semiHidden="0" w:name="Colorful List"/>
-    <w:lsdException w:unhideWhenUsed="0" w:uiPriority="73" w:semiHidden="0" w:name="Colorful Grid"/>
-    <w:lsdException w:unhideWhenUsed="0" w:uiPriority="60" w:semiHidden="0" w:name="Light Shading Accent 1"/>
-    <w:lsdException w:unhideWhenUsed="0" w:uiPriority="61" w:semiHidden="0" w:name="Light List Accent 1"/>
-    <w:lsdException w:unhideWhenUsed="0" w:uiPriority="62" w:semiHidden="0" w:name="Light Grid Accent 1"/>
-    <w:lsdException w:unhideWhenUsed="0" w:uiPriority="63" w:semiHidden="0" w:name="Medium Shading 1 Accent 1"/>
-    <w:lsdException w:unhideWhenUsed="0" w:uiPriority="64" w:semiHidden="0" w:name="Medium Shading 2 Accent 1"/>
-    <w:lsdException w:unhideWhenUsed="0" w:uiPriority="65" w:semiHidden="0" w:name="Medium List 1 Accent 1"/>
-    <w:lsdException w:unhideWhenUsed="0" w:uiPriority="66" w:semiHidden="0" w:name="Medium List 2 Accent 1"/>
-    <w:lsdException w:unhideWhenUsed="0" w:uiPriority="67" w:semiHidden="0" w:name="Medium Grid 1 Accent 1"/>
-    <w:lsdException w:unhideWhenUsed="0" w:uiPriority="68" w:semiHidden="0" w:name="Medium Grid 2 Accent 1"/>
-    <w:lsdException w:unhideWhenUsed="0" w:uiPriority="69" w:semiHidden="0" w:name="Medium Grid 3 Accent 1"/>
-    <w:lsdException w:unhideWhenUsed="0" w:uiPriority="70" w:semiHidden="0" w:name="Dark List Accent 1"/>
-    <w:lsdException w:unhideWhenUsed="0" w:uiPriority="71" w:semiHidden="0" w:name="Colorful Shading Accent 1"/>
-    <w:lsdException w:unhideWhenUsed="0" w:uiPriority="72" w:semiHidden="0" w:name="Colorful List Accent 1"/>
-    <w:lsdException w:unhideWhenUsed="0" w:uiPriority="73" w:semiHidden="0" w:name="Colorful Grid Accent 1"/>
-    <w:lsdException w:unhideWhenUsed="0" w:uiPriority="60" w:semiHidden="0" w:name="Light Shading Accent 2"/>
-    <w:lsdException w:unhideWhenUsed="0" w:uiPriority="61" w:semiHidden="0" w:name="Light List Accent 2"/>
-    <w:lsdException w:unhideWhenUsed="0" w:uiPriority="62" w:semiHidden="0" w:name="Light Grid Accent 2"/>
-    <w:lsdException w:unhideWhenUsed="0" w:uiPriority="63" w:semiHidden="0" w:name="Medium Shading 1 Accent 2"/>
-    <w:lsdException w:unhideWhenUsed="0" w:uiPriority="64" w:semiHidden="0" w:name="Medium Shading 2 Accent 2"/>
-    <w:lsdException w:unhideWhenUsed="0" w:uiPriority="65" w:semiHidden="0" w:name="Medium List 1 Accent 2"/>
-    <w:lsdException w:unhideWhenUsed="0" w:uiPriority="66" w:semiHidden="0" w:name="Medium List 2 Accent 2"/>
-    <w:lsdException w:unhideWhenUsed="0" w:uiPriority="67" w:semiHidden="0" w:name="Medium Grid 1 Accent 2"/>
-    <w:lsdException w:unhideWhenUsed="0" w:uiPriority="68" w:semiHidden="0" w:name="Medium Grid 2 Accent 2"/>
-    <w:lsdException w:unhideWhenUsed="0" w:uiPriority="69" w:semiHidden="0" w:name="Medium Grid 3 Accent 2"/>
-    <w:lsdException w:unhideWhenUsed="0" w:uiPriority="70" w:semiHidden="0" w:name="Dark List Accent 2"/>
-    <w:lsdException w:unhideWhenUsed="0" w:uiPriority="71" w:semiHidden="0" w:name="Colorful Shading Accent 2"/>
-    <w:lsdException w:unhideWhenUsed="0" w:uiPriority="72" w:semiHidden="0" w:name="Colorful List Accent 2"/>
-    <w:lsdException w:unhideWhenUsed="0" w:uiPriority="73" w:semiHidden="0" w:name="Colorful Grid Accent 2"/>
-    <w:lsdException w:unhideWhenUsed="0" w:uiPriority="60" w:semiHidden="0" w:name="Light Shading Accent 3"/>
-    <w:lsdException w:unhideWhenUsed="0" w:uiPriority="61" w:semiHidden="0" w:name="Light List Accent 3"/>
-    <w:lsdException w:unhideWhenUsed="0" w:uiPriority="62" w:semiHidden="0" w:name="Light Grid Accent 3"/>
-    <w:lsdException w:unhideWhenUsed="0" w:uiPriority="63" w:semiHidden="0" w:name="Medium Shading 1 Accent 3"/>
-    <w:lsdException w:unhideWhenUsed="0" w:uiPriority="64" w:semiHidden="0" w:name="Medium Shading 2 Accent 3"/>
-    <w:lsdException w:unhideWhenUsed="0" w:uiPriority="65" w:semiHidden="0" w:name="Medium List 1 Accent 3"/>
-    <w:lsdException w:unhideWhenUsed="0" w:uiPriority="66" w:semiHidden="0" w:name="Medium List 2 Accent 3"/>
-    <w:lsdException w:unhideWhenUsed="0" w:uiPriority="67" w:semiHidden="0" w:name="Medium Grid 1 Accent 3"/>
-    <w:lsdException w:unhideWhenUsed="0" w:uiPriority="68" w:semiHidden="0" w:name="Medium Grid 2 Accent 3"/>
-    <w:lsdException w:unhideWhenUsed="0" w:uiPriority="69" w:semiHidden="0" w:name="Medium Grid 3 Accent 3"/>
-    <w:lsdException w:unhideWhenUsed="0" w:uiPriority="70" w:semiHidden="0" w:name="Dark List Accent 3"/>
-    <w:lsdException w:unhideWhenUsed="0" w:uiPriority="71" w:semiHidden="0" w:name="Colorful Shading Accent 3"/>
-    <w:lsdException w:unhideWhenUsed="0" w:uiPriority="72" w:semiHidden="0" w:name="Colorful List Accent 3"/>
-    <w:lsdException w:unhideWhenUsed="0" w:uiPriority="73" w:semiHidden="0" w:name="Colorful Grid Accent 3"/>
-    <w:lsdException w:unhideWhenUsed="0" w:uiPriority="60" w:semiHidden="0" w:name="Light Shading Accent 4"/>
-    <w:lsdException w:unhideWhenUsed="0" w:uiPriority="61" w:semiHidden="0" w:name="Light List Accent 4"/>
-    <w:lsdException w:unhideWhenUsed="0" w:uiPriority="62" w:semiHidden="0" w:name="Light Grid Accent 4"/>
-    <w:lsdException w:unhideWhenUsed="0" w:uiPriority="63" w:semiHidden="0" w:name="Medium Shading 1 Accent 4"/>
-    <w:lsdException w:unhideWhenUsed="0" w:uiPriority="64" w:semiHidden="0" w:name="Medium Shading 2 Accent 4"/>
-    <w:lsdException w:unhideWhenUsed="0" w:uiPriority="65" w:semiHidden="0" w:name="Medium List 1 Accent 4"/>
-    <w:lsdException w:unhideWhenUsed="0" w:uiPriority="66" w:semiHidden="0" w:name="Medium List 2 Accent 4"/>
-    <w:lsdException w:unhideWhenUsed="0" w:uiPriority="67" w:semiHidden="0" w:name="Medium Grid 1 Accent 4"/>
-    <w:lsdException w:unhideWhenUsed="0" w:uiPriority="68" w:semiHidden="0" w:name="Medium Grid 2 Accent 4"/>
-    <w:lsdException w:unhideWhenUsed="0" w:uiPriority="69" w:semiHidden="0" w:name="Medium Grid 3 Accent 4"/>
-    <w:lsdException w:unhideWhenUsed="0" w:uiPriority="70" w:semiHidden="0" w:name="Dark List Accent 4"/>
-    <w:lsdException w:unhideWhenUsed="0" w:uiPriority="71" w:semiHidden="0" w:name="Colorful Shading Accent 4"/>
-    <w:lsdException w:unhideWhenUsed="0" w:uiPriority="72" w:semiHidden="0" w:name="Colorful List Accent 4"/>
-    <w:lsdException w:unhideWhenUsed="0" w:uiPriority="73" w:semiHidden="0" w:name="Colorful Grid Accent 4"/>
-    <w:lsdException w:unhideWhenUsed="0" w:uiPriority="60" w:semiHidden="0" w:name="Light Shading Accent 5"/>
-    <w:lsdException w:unhideWhenUsed="0" w:uiPriority="61" w:semiHidden="0" w:name="Light List Accent 5"/>
-    <w:lsdException w:unhideWhenUsed="0" w:uiPriority="62" w:semiHidden="0" w:name="Light Grid Accent 5"/>
-    <w:lsdException w:unhideWhenUsed="0" w:uiPriority="63" w:semiHidden="0" w:name="Medium Shading 1 Accent 5"/>
-    <w:lsdException w:unhideWhenUsed="0" w:uiPriority="64" w:semiHidden="0" w:name="Medium Shading 2 Accent 5"/>
-    <w:lsdException w:unhideWhenUsed="0" w:uiPriority="65" w:semiHidden="0" w:name="Medium List 1 Accent 5"/>
-    <w:lsdException w:unhideWhenUsed="0" w:uiPriority="66" w:semiHidden="0" w:name="Medium List 2 Accent 5"/>
-    <w:lsdException w:unhideWhenUsed="0" w:uiPriority="67" w:semiHidden="0" w:name="Medium Grid 1 Accent 5"/>
-    <w:lsdException w:unhideWhenUsed="0" w:uiPriority="68" w:semiHidden="0" w:name="Medium Grid 2 Accent 5"/>
-    <w:lsdException w:unhideWhenUsed="0" w:uiPriority="69" w:semiHidden="0" w:name="Medium Grid 3 Accent 5"/>
-    <w:lsdException w:unhideWhenUsed="0" w:uiPriority="70" w:semiHidden="0" w:name="Dark List Accent 5"/>
-    <w:lsdException w:unhideWhenUsed="0" w:uiPriority="71" w:semiHidden="0" w:name="Colorful Shading Accent 5"/>
-    <w:lsdException w:unhideWhenUsed="0" w:uiPriority="72" w:semiHidden="0" w:name="Colorful List Accent 5"/>
-    <w:lsdException w:unhideWhenUsed="0" w:uiPriority="73" w:semiHidden="0" w:name="Colorful Grid Accent 5"/>
-    <w:lsdException w:unhideWhenUsed="0" w:uiPriority="60" w:semiHidden="0" w:name="Light Shading Accent 6"/>
-    <w:lsdException w:unhideWhenUsed="0" w:uiPriority="61" w:semiHidden="0" w:name="Light List Accent 6"/>
-    <w:lsdException w:unhideWhenUsed="0" w:uiPriority="62" w:semiHidden="0" w:name="Light Grid Accent 6"/>
-    <w:lsdException w:unhideWhenUsed="0" w:uiPriority="63" w:semiHidden="0" w:name="Medium Shading 1 Accent 6"/>
-    <w:lsdException w:unhideWhenUsed="0" w:uiPriority="64" w:semiHidden="0" w:name="Medium Shading 2 Accent 6"/>
-    <w:lsdException w:unhideWhenUsed="0" w:uiPriority="65" w:semiHidden="0" w:name="Medium List 1 Accent 6"/>
-    <w:lsdException w:unhideWhenUsed="0" w:uiPriority="66" w:semiHidden="0" w:name="Medium List 2 Accent 6"/>
-    <w:lsdException w:unhideWhenUsed="0" w:uiPriority="67" w:semiHidden="0" w:name="Medium Grid 1 Accent 6"/>
-    <w:lsdException w:unhideWhenUsed="0" w:uiPriority="68" w:semiHidden="0" w:name="Medium Grid 2 Accent 6"/>
-    <w:lsdException w:unhideWhenUsed="0" w:uiPriority="69" w:semiHidden="0" w:name="Medium Grid 3 Accent 6"/>
-    <w:lsdException w:unhideWhenUsed="0" w:uiPriority="70" w:semiHidden="0" w:name="Dark List Accent 6"/>
-    <w:lsdException w:unhideWhenUsed="0" w:uiPriority="71" w:semiHidden="0" w:name="Colorful Shading Accent 6"/>
-    <w:lsdException w:unhideWhenUsed="0" w:uiPriority="72" w:semiHidden="0" w:name="Colorful List Accent 6"/>
-    <w:lsdException w:unhideWhenUsed="0" w:uiPriority="73" w:semiHidden="0" w:name="Colorful Grid Accent 6"/>
+  <w:latentStyles w:defLockedState="0" w:defUIPriority="0" w:defSemiHidden="0" w:defUnhideWhenUsed="0" w:defQFormat="0" w:count="376">
+    <w:lsdException w:name="Normal" w:qFormat="1"/>
+    <w:lsdException w:name="heading 1" w:qFormat="1"/>
+    <w:lsdException w:name="heading 2" w:semiHidden="1" w:unhideWhenUsed="1" w:qFormat="1"/>
+    <w:lsdException w:name="heading 3" w:semiHidden="1" w:unhideWhenUsed="1" w:qFormat="1"/>
+    <w:lsdException w:name="heading 4" w:semiHidden="1" w:unhideWhenUsed="1" w:qFormat="1"/>
+    <w:lsdException w:name="heading 5" w:semiHidden="1" w:unhideWhenUsed="1" w:qFormat="1"/>
+    <w:lsdException w:name="heading 6" w:semiHidden="1" w:unhideWhenUsed="1" w:qFormat="1"/>
+    <w:lsdException w:name="heading 7" w:semiHidden="1" w:unhideWhenUsed="1" w:qFormat="1"/>
+    <w:lsdException w:name="heading 8" w:semiHidden="1" w:unhideWhenUsed="1" w:qFormat="1"/>
+    <w:lsdException w:name="heading 9" w:semiHidden="1" w:unhideWhenUsed="1" w:qFormat="1"/>
+    <w:lsdException w:name="caption" w:semiHidden="1" w:unhideWhenUsed="1" w:qFormat="1"/>
+    <w:lsdException w:name="Title" w:qFormat="1"/>
+    <w:lsdException w:name="Default Paragraph Font" w:semiHidden="1"/>
+    <w:lsdException w:name="Subtitle" w:qFormat="1"/>
+    <w:lsdException w:name="Strong" w:qFormat="1"/>
+    <w:lsdException w:name="Emphasis" w:qFormat="1"/>
+    <w:lsdException w:name="HTML Top of Form" w:semiHidden="1" w:uiPriority="99" w:unhideWhenUsed="1"/>
+    <w:lsdException w:name="HTML Bottom of Form" w:semiHidden="1" w:uiPriority="99" w:unhideWhenUsed="1"/>
+    <w:lsdException w:name="Normal Table" w:semiHidden="1" w:unhideWhenUsed="1"/>
+    <w:lsdException w:name="No List" w:semiHidden="1" w:uiPriority="99" w:unhideWhenUsed="1"/>
+    <w:lsdException w:name="Outline List 1" w:semiHidden="1" w:uiPriority="99" w:unhideWhenUsed="1"/>
+    <w:lsdException w:name="Outline List 2" w:semiHidden="1" w:uiPriority="99" w:unhideWhenUsed="1"/>
+    <w:lsdException w:name="Outline List 3" w:semiHidden="1" w:uiPriority="99" w:unhideWhenUsed="1"/>
+    <w:lsdException w:name="Table Simple 1" w:semiHidden="1" w:unhideWhenUsed="1"/>
+    <w:lsdException w:name="Table Simple 2" w:semiHidden="1" w:unhideWhenUsed="1"/>
+    <w:lsdException w:name="Table Simple 3" w:semiHidden="1" w:unhideWhenUsed="1"/>
+    <w:lsdException w:name="Table Classic 1" w:semiHidden="1" w:unhideWhenUsed="1"/>
+    <w:lsdException w:name="Table Classic 2" w:semiHidden="1" w:unhideWhenUsed="1"/>
+    <w:lsdException w:name="Table Classic 3" w:semiHidden="1" w:unhideWhenUsed="1"/>
+    <w:lsdException w:name="Table Classic 4" w:semiHidden="1" w:unhideWhenUsed="1"/>
+    <w:lsdException w:name="Table Colorful 1" w:semiHidden="1" w:unhideWhenUsed="1"/>
+    <w:lsdException w:name="Table Colorful 2" w:semiHidden="1" w:unhideWhenUsed="1"/>
+    <w:lsdException w:name="Table Colorful 3" w:semiHidden="1" w:unhideWhenUsed="1"/>
+    <w:lsdException w:name="Table Columns 1" w:semiHidden="1" w:unhideWhenUsed="1"/>
+    <w:lsdException w:name="Table Columns 2" w:semiHidden="1" w:unhideWhenUsed="1"/>
+    <w:lsdException w:name="Table Columns 3" w:semiHidden="1" w:unhideWhenUsed="1"/>
+    <w:lsdException w:name="Table Columns 4" w:semiHidden="1" w:unhideWhenUsed="1"/>
+    <w:lsdException w:name="Table Columns 5" w:semiHidden="1" w:unhideWhenUsed="1"/>
+    <w:lsdException w:name="Table Grid 1" w:semiHidden="1" w:unhideWhenUsed="1"/>
+    <w:lsdException w:name="Table Grid 2" w:semiHidden="1" w:unhideWhenUsed="1"/>
+    <w:lsdException w:name="Table Grid 3" w:semiHidden="1" w:unhideWhenUsed="1"/>
+    <w:lsdException w:name="Table Grid 4" w:semiHidden="1" w:unhideWhenUsed="1"/>
+    <w:lsdException w:name="Table Grid 5" w:semiHidden="1" w:unhideWhenUsed="1"/>
+    <w:lsdException w:name="Table Grid 6" w:semiHidden="1" w:unhideWhenUsed="1"/>
+    <w:lsdException w:name="Table Grid 7" w:semiHidden="1" w:unhideWhenUsed="1"/>
+    <w:lsdException w:name="Table Grid 8" w:semiHidden="1" w:unhideWhenUsed="1"/>
+    <w:lsdException w:name="Table List 1" w:semiHidden="1" w:unhideWhenUsed="1"/>
+    <w:lsdException w:name="Table List 2" w:semiHidden="1" w:unhideWhenUsed="1"/>
+    <w:lsdException w:name="Table List 3" w:semiHidden="1" w:unhideWhenUsed="1"/>
+    <w:lsdException w:name="Table List 4" w:semiHidden="1" w:unhideWhenUsed="1"/>
+    <w:lsdException w:name="Table List 5" w:semiHidden="1" w:unhideWhenUsed="1"/>
+    <w:lsdException w:name="Table List 6" w:semiHidden="1" w:unhideWhenUsed="1"/>
+    <w:lsdException w:name="Table List 7" w:semiHidden="1" w:unhideWhenUsed="1"/>
+    <w:lsdException w:name="Table List 8" w:semiHidden="1" w:unhideWhenUsed="1"/>
+    <w:lsdException w:name="Table 3D effects 1" w:semiHidden="1" w:unhideWhenUsed="1"/>
+    <w:lsdException w:name="Table 3D effects 2" w:semiHidden="1" w:unhideWhenUsed="1"/>
+    <w:lsdException w:name="Table 3D effects 3" w:semiHidden="1" w:unhideWhenUsed="1"/>
+    <w:lsdException w:name="Table Contemporary" w:semiHidden="1" w:unhideWhenUsed="1"/>
+    <w:lsdException w:name="Table Elegant" w:semiHidden="1" w:unhideWhenUsed="1"/>
+    <w:lsdException w:name="Table Professional" w:semiHidden="1" w:unhideWhenUsed="1"/>
+    <w:lsdException w:name="Table Subtle 1" w:semiHidden="1" w:unhideWhenUsed="1"/>
+    <w:lsdException w:name="Table Subtle 2" w:semiHidden="1" w:unhideWhenUsed="1"/>
+    <w:lsdException w:name="Table Web 1" w:semiHidden="1" w:unhideWhenUsed="1"/>
+    <w:lsdException w:name="Table Web 2" w:semiHidden="1" w:unhideWhenUsed="1"/>
+    <w:lsdException w:name="Table Web 3" w:semiHidden="1" w:unhideWhenUsed="1"/>
+    <w:lsdException w:name="Table Theme" w:semiHidden="1" w:unhideWhenUsed="1"/>
+    <w:lsdException w:name="Placeholder Text" w:semiHidden="1" w:uiPriority="99" w:unhideWhenUsed="1"/>
+    <w:lsdException w:name="No Spacing" w:semiHidden="1" w:uiPriority="99" w:unhideWhenUsed="1"/>
+    <w:lsdException w:name="Light Shading" w:uiPriority="60"/>
+    <w:lsdException w:name="Light List" w:uiPriority="61"/>
+    <w:lsdException w:name="Light Grid" w:uiPriority="62"/>
+    <w:lsdException w:name="Medium Shading 1" w:uiPriority="63"/>
+    <w:lsdException w:name="Medium Shading 2" w:uiPriority="64"/>
+    <w:lsdException w:name="Medium List 1" w:uiPriority="65"/>
+    <w:lsdException w:name="Medium List 2" w:uiPriority="66"/>
+    <w:lsdException w:name="Medium Grid 1" w:uiPriority="67"/>
+    <w:lsdException w:name="Medium Grid 2" w:uiPriority="68"/>
+    <w:lsdException w:name="Medium Grid 3" w:uiPriority="69"/>
+    <w:lsdException w:name="Dark List" w:uiPriority="70"/>
+    <w:lsdException w:name="Colorful Shading" w:uiPriority="71"/>
+    <w:lsdException w:name="Colorful List" w:uiPriority="72"/>
+    <w:lsdException w:name="Colorful Grid" w:uiPriority="73"/>
+    <w:lsdException w:name="Light Shading Accent 1" w:uiPriority="60"/>
+    <w:lsdException w:name="Light List Accent 1" w:uiPriority="61"/>
+    <w:lsdException w:name="Light Grid Accent 1" w:uiPriority="62"/>
+    <w:lsdException w:name="Medium Shading 1 Accent 1" w:uiPriority="63"/>
+    <w:lsdException w:name="Medium Shading 2 Accent 1" w:uiPriority="64"/>
+    <w:lsdException w:name="Medium List 1 Accent 1" w:uiPriority="65"/>
+    <w:lsdException w:name="Revision" w:semiHidden="1" w:uiPriority="99" w:unhideWhenUsed="1"/>
+    <w:lsdException w:name="List Paragraph" w:semiHidden="1" w:uiPriority="99" w:unhideWhenUsed="1"/>
+    <w:lsdException w:name="Quote" w:semiHidden="1" w:uiPriority="99" w:unhideWhenUsed="1"/>
+    <w:lsdException w:name="Intense Quote" w:semiHidden="1" w:uiPriority="99" w:unhideWhenUsed="1"/>
+    <w:lsdException w:name="Medium List 2 Accent 1" w:uiPriority="66"/>
+    <w:lsdException w:name="Medium Grid 1 Accent 1" w:uiPriority="67"/>
+    <w:lsdException w:name="Medium Grid 2 Accent 1" w:uiPriority="68"/>
+    <w:lsdException w:name="Medium Grid 3 Accent 1" w:uiPriority="69"/>
+    <w:lsdException w:name="Dark List Accent 1" w:uiPriority="70"/>
+    <w:lsdException w:name="Colorful Shading Accent 1" w:uiPriority="71"/>
+    <w:lsdException w:name="Colorful List Accent 1" w:uiPriority="72"/>
+    <w:lsdException w:name="Colorful Grid Accent 1" w:uiPriority="73"/>
+    <w:lsdException w:name="Light Shading Accent 2" w:uiPriority="60"/>
+    <w:lsdException w:name="Light List Accent 2" w:uiPriority="61"/>
+    <w:lsdException w:name="Light Grid Accent 2" w:uiPriority="62"/>
+    <w:lsdException w:name="Medium Shading 1 Accent 2" w:uiPriority="63"/>
+    <w:lsdException w:name="Medium Shading 2 Accent 2" w:uiPriority="64"/>
+    <w:lsdException w:name="Medium List 1 Accent 2" w:uiPriority="65"/>
+    <w:lsdException w:name="Medium List 2 Accent 2" w:uiPriority="66"/>
+    <w:lsdException w:name="Medium Grid 1 Accent 2" w:uiPriority="67"/>
+    <w:lsdException w:name="Medium Grid 2 Accent 2" w:uiPriority="68"/>
+    <w:lsdException w:name="Medium Grid 3 Accent 2" w:uiPriority="69"/>
+    <w:lsdException w:name="Dark List Accent 2" w:uiPriority="70"/>
+    <w:lsdException w:name="Colorful Shading Accent 2" w:uiPriority="71"/>
+    <w:lsdException w:name="Colorful List Accent 2" w:uiPriority="72"/>
+    <w:lsdException w:name="Colorful Grid Accent 2" w:uiPriority="73"/>
+    <w:lsdException w:name="Light Shading Accent 3" w:uiPriority="60"/>
+    <w:lsdException w:name="Light List Accent 3" w:uiPriority="61"/>
+    <w:lsdException w:name="Light Grid Accent 3" w:uiPriority="62"/>
+    <w:lsdException w:name="Medium Shading 1 Accent 3" w:uiPriority="63"/>
+    <w:lsdException w:name="Medium Shading 2 Accent 3" w:uiPriority="64"/>
+    <w:lsdException w:name="Medium List 1 Accent 3" w:uiPriority="65"/>
+    <w:lsdException w:name="Medium List 2 Accent 3" w:uiPriority="66"/>
+    <w:lsdException w:name="Medium Grid 1 Accent 3" w:uiPriority="67"/>
+    <w:lsdException w:name="Medium Grid 2 Accent 3" w:uiPriority="68"/>
+    <w:lsdException w:name="Medium Grid 3 Accent 3" w:uiPriority="69"/>
+    <w:lsdException w:name="Dark List Accent 3" w:uiPriority="70"/>
+    <w:lsdException w:name="Colorful Shading Accent 3" w:uiPriority="71"/>
+    <w:lsdException w:name="Colorful List Accent 3" w:uiPriority="72"/>
+    <w:lsdException w:name="Colorful Grid Accent 3" w:uiPriority="73"/>
+    <w:lsdException w:name="Light Shading Accent 4" w:uiPriority="60"/>
+    <w:lsdException w:name="Light List Accent 4" w:uiPriority="61"/>
+    <w:lsdException w:name="Light Grid Accent 4" w:uiPriority="62"/>
+    <w:lsdException w:name="Medium Shading 1 Accent 4" w:uiPriority="63"/>
+    <w:lsdException w:name="Medium Shading 2 Accent 4" w:uiPriority="64"/>
+    <w:lsdException w:name="Medium List 1 Accent 4" w:uiPriority="65"/>
+    <w:lsdException w:name="Medium List 2 Accent 4" w:uiPriority="66"/>
+    <w:lsdException w:name="Medium Grid 1 Accent 4" w:uiPriority="67"/>
+    <w:lsdException w:name="Medium Grid 2 Accent 4" w:uiPriority="68"/>
+    <w:lsdException w:name="Medium Grid 3 Accent 4" w:uiPriority="69"/>
+    <w:lsdException w:name="Dark List Accent 4" w:uiPriority="70"/>
+    <w:lsdException w:name="Colorful Shading Accent 4" w:uiPriority="71"/>
+    <w:lsdException w:name="Colorful List Accent 4" w:uiPriority="72"/>
+    <w:lsdException w:name="Colorful Grid Accent 4" w:uiPriority="73"/>
+    <w:lsdException w:name="Light Shading Accent 5" w:uiPriority="60"/>
+    <w:lsdException w:name="Light List Accent 5" w:uiPriority="61"/>
+    <w:lsdException w:name="Light Grid Accent 5" w:uiPriority="62"/>
+    <w:lsdException w:name="Medium Shading 1 Accent 5" w:uiPriority="63"/>
+    <w:lsdException w:name="Medium Shading 2 Accent 5" w:uiPriority="64"/>
+    <w:lsdException w:name="Medium List 1 Accent 5" w:uiPriority="65"/>
+    <w:lsdException w:name="Medium List 2 Accent 5" w:uiPriority="66"/>
+    <w:lsdException w:name="Medium Grid 1 Accent 5" w:uiPriority="67"/>
+    <w:lsdException w:name="Medium Grid 2 Accent 5" w:uiPriority="68"/>
+    <w:lsdException w:name="Medium Grid 3 Accent 5" w:uiPriority="69"/>
+    <w:lsdException w:name="Dark List Accent 5" w:uiPriority="70"/>
+    <w:lsdException w:name="Colorful Shading Accent 5" w:uiPriority="71"/>
+    <w:lsdException w:name="Colorful List Accent 5" w:uiPriority="72"/>
+    <w:lsdException w:name="Colorful Grid Accent 5" w:uiPriority="73"/>
+    <w:lsdException w:name="Light Shading Accent 6" w:uiPriority="60"/>
+    <w:lsdException w:name="Light List Accent 6" w:uiPriority="61"/>
+    <w:lsdException w:name="Light Grid Accent 6" w:uiPriority="62"/>
+    <w:lsdException w:name="Medium Shading 1 Accent 6" w:uiPriority="63"/>
+    <w:lsdException w:name="Medium Shading 2 Accent 6" w:uiPriority="64"/>
+    <w:lsdException w:name="Medium List 1 Accent 6" w:uiPriority="65"/>
+    <w:lsdException w:name="Medium List 2 Accent 6" w:uiPriority="66"/>
+    <w:lsdException w:name="Medium Grid 1 Accent 6" w:uiPriority="67"/>
+    <w:lsdException w:name="Medium Grid 2 Accent 6" w:uiPriority="68"/>
+    <w:lsdException w:name="Medium Grid 3 Accent 6" w:uiPriority="69"/>
+    <w:lsdException w:name="Dark List Accent 6" w:uiPriority="70"/>
+    <w:lsdException w:name="Colorful Shading Accent 6" w:uiPriority="71"/>
+    <w:lsdException w:name="Colorful List Accent 6" w:uiPriority="72"/>
+    <w:lsdException w:name="Colorful Grid Accent 6" w:uiPriority="73"/>
+    <w:lsdException w:name="Subtle Emphasis" w:uiPriority="19" w:qFormat="1"/>
+    <w:lsdException w:name="Intense Emphasis" w:uiPriority="21" w:qFormat="1"/>
+    <w:lsdException w:name="Subtle Reference" w:uiPriority="31" w:qFormat="1"/>
+    <w:lsdException w:name="Intense Reference" w:uiPriority="32" w:qFormat="1"/>
+    <w:lsdException w:name="Book Title" w:uiPriority="33" w:qFormat="1"/>
+    <w:lsdException w:name="Bibliography" w:semiHidden="1" w:uiPriority="37" w:unhideWhenUsed="1"/>
+    <w:lsdException w:name="TOC Heading" w:semiHidden="1" w:uiPriority="39" w:unhideWhenUsed="1" w:qFormat="1"/>
+    <w:lsdException w:name="Plain Table 1" w:uiPriority="41"/>
+    <w:lsdException w:name="Plain Table 2" w:uiPriority="42"/>
+    <w:lsdException w:name="Plain Table 3" w:uiPriority="43"/>
+    <w:lsdException w:name="Plain Table 4" w:uiPriority="44"/>
+    <w:lsdException w:name="Plain Table 5" w:uiPriority="45"/>
+    <w:lsdException w:name="Grid Table Light" w:uiPriority="40"/>
+    <w:lsdException w:name="Grid Table 1 Light" w:uiPriority="46"/>
+    <w:lsdException w:name="Grid Table 2" w:uiPriority="47"/>
+    <w:lsdException w:name="Grid Table 3" w:uiPriority="48"/>
+    <w:lsdException w:name="Grid Table 4" w:uiPriority="49"/>
+    <w:lsdException w:name="Grid Table 5 Dark" w:uiPriority="50"/>
+    <w:lsdException w:name="Grid Table 6 Colorful" w:uiPriority="51"/>
+    <w:lsdException w:name="Grid Table 7 Colorful" w:uiPriority="52"/>
+    <w:lsdException w:name="Grid Table 1 Light Accent 1" w:uiPriority="46"/>
+    <w:lsdException w:name="Grid Table 2 Accent 1" w:uiPriority="47"/>
+    <w:lsdException w:name="Grid Table 3 Accent 1" w:uiPriority="48"/>
+    <w:lsdException w:name="Grid Table 4 Accent 1" w:uiPriority="49"/>
+    <w:lsdException w:name="Grid Table 5 Dark Accent 1" w:uiPriority="50"/>
+    <w:lsdException w:name="Grid Table 6 Colorful Accent 1" w:uiPriority="51"/>
+    <w:lsdException w:name="Grid Table 7 Colorful Accent 1" w:uiPriority="52"/>
+    <w:lsdException w:name="Grid Table 1 Light Accent 2" w:uiPriority="46"/>
+    <w:lsdException w:name="Grid Table 2 Accent 2" w:uiPriority="47"/>
+    <w:lsdException w:name="Grid Table 3 Accent 2" w:uiPriority="48"/>
+    <w:lsdException w:name="Grid Table 4 Accent 2" w:uiPriority="49"/>
+    <w:lsdException w:name="Grid Table 5 Dark Accent 2" w:uiPriority="50"/>
+    <w:lsdException w:name="Grid Table 6 Colorful Accent 2" w:uiPriority="51"/>
+    <w:lsdException w:name="Grid Table 7 Colorful Accent 2" w:uiPriority="52"/>
+    <w:lsdException w:name="Grid Table 1 Light Accent 3" w:uiPriority="46"/>
+    <w:lsdException w:name="Grid Table 2 Accent 3" w:uiPriority="47"/>
+    <w:lsdException w:name="Grid Table 3 Accent 3" w:uiPriority="48"/>
+    <w:lsdException w:name="Grid Table 4 Accent 3" w:uiPriority="49"/>
+    <w:lsdException w:name="Grid Table 5 Dark Accent 3" w:uiPriority="50"/>
+    <w:lsdException w:name="Grid Table 6 Colorful Accent 3" w:uiPriority="51"/>
+    <w:lsdException w:name="Grid Table 7 Colorful Accent 3" w:uiPriority="52"/>
+    <w:lsdException w:name="Grid Table 1 Light Accent 4" w:uiPriority="46"/>
+    <w:lsdException w:name="Grid Table 2 Accent 4" w:uiPriority="47"/>
+    <w:lsdException w:name="Grid Table 3 Accent 4" w:uiPriority="48"/>
+    <w:lsdException w:name="Grid Table 4 Accent 4" w:uiPriority="49"/>
+    <w:lsdException w:name="Grid Table 5 Dark Accent 4" w:uiPriority="50"/>
+    <w:lsdException w:name="Grid Table 6 Colorful Accent 4" w:uiPriority="51"/>
+    <w:lsdException w:name="Grid Table 7 Colorful Accent 4" w:uiPriority="52"/>
+    <w:lsdException w:name="Grid Table 1 Light Accent 5" w:uiPriority="46"/>
+    <w:lsdException w:name="Grid Table 2 Accent 5" w:uiPriority="47"/>
+    <w:lsdException w:name="Grid Table 3 Accent 5" w:uiPriority="48"/>
+    <w:lsdException w:name="Grid Table 4 Accent 5" w:uiPriority="49"/>
+    <w:lsdException w:name="Grid Table 5 Dark Accent 5" w:uiPriority="50"/>
+    <w:lsdException w:name="Grid Table 6 Colorful Accent 5" w:uiPriority="51"/>
+    <w:lsdException w:name="Grid Table 7 Colorful Accent 5" w:uiPriority="52"/>
+    <w:lsdException w:name="Grid Table 1 Light Accent 6" w:uiPriority="46"/>
+    <w:lsdException w:name="Grid Table 2 Accent 6" w:uiPriority="47"/>
+    <w:lsdException w:name="Grid Table 3 Accent 6" w:uiPriority="48"/>
+    <w:lsdException w:name="Grid Table 4 Accent 6" w:uiPriority="49"/>
+    <w:lsdException w:name="Grid Table 5 Dark Accent 6" w:uiPriority="50"/>
+    <w:lsdException w:name="Grid Table 6 Colorful Accent 6" w:uiPriority="51"/>
+    <w:lsdException w:name="Grid Table 7 Colorful Accent 6" w:uiPriority="52"/>
+    <w:lsdException w:name="List Table 1 Light" w:uiPriority="46"/>
+    <w:lsdException w:name="List Table 2" w:uiPriority="47"/>
+    <w:lsdException w:name="List Table 3" w:uiPriority="48"/>
+    <w:lsdException w:name="List Table 4" w:uiPriority="49"/>
+    <w:lsdException w:name="List Table 5 Dark" w:uiPriority="50"/>
+    <w:lsdException w:name="List Table 6 Colorful" w:uiPriority="51"/>
+    <w:lsdException w:name="List Table 7 Colorful" w:uiPriority="52"/>
+    <w:lsdException w:name="List Table 1 Light Accent 1" w:uiPriority="46"/>
+    <w:lsdException w:name="List Table 2 Accent 1" w:uiPriority="47"/>
+    <w:lsdException w:name="List Table 3 Accent 1" w:uiPriority="48"/>
+    <w:lsdException w:name="List Table 4 Accent 1" w:uiPriority="49"/>
+    <w:lsdException w:name="List Table 5 Dark Accent 1" w:uiPriority="50"/>
+    <w:lsdException w:name="List Table 6 Colorful Accent 1" w:uiPriority="51"/>
+    <w:lsdException w:name="List Table 7 Colorful Accent 1" w:uiPriority="52"/>
+    <w:lsdException w:name="List Table 1 Light Accent 2" w:uiPriority="46"/>
+    <w:lsdException w:name="List Table 2 Accent 2" w:uiPriority="47"/>
+    <w:lsdException w:name="List Table 3 Accent 2" w:uiPriority="48"/>
+    <w:lsdException w:name="List Table 4 Accent 2" w:uiPriority="49"/>
+    <w:lsdException w:name="List Table 5 Dark Accent 2" w:uiPriority="50"/>
+    <w:lsdException w:name="List Table 6 Colorful Accent 2" w:uiPriority="51"/>
+    <w:lsdException w:name="List Table 7 Colorful Accent 2" w:uiPriority="52"/>
+    <w:lsdException w:name="List Table 1 Light Accent 3" w:uiPriority="46"/>
+    <w:lsdException w:name="List Table 2 Accent 3" w:uiPriority="47"/>
+    <w:lsdException w:name="List Table 3 Accent 3" w:uiPriority="48"/>
+    <w:lsdException w:name="List Table 4 Accent 3" w:uiPriority="49"/>
+    <w:lsdException w:name="List Table 5 Dark Accent 3" w:uiPriority="50"/>
+    <w:lsdException w:name="List Table 6 Colorful Accent 3" w:uiPriority="51"/>
+    <w:lsdException w:name="List Table 7 Colorful Accent 3" w:uiPriority="52"/>
+    <w:lsdException w:name="List Table 1 Light Accent 4" w:uiPriority="46"/>
+    <w:lsdException w:name="List Table 2 Accent 4" w:uiPriority="47"/>
+    <w:lsdException w:name="List Table 3 Accent 4" w:uiPriority="48"/>
+    <w:lsdException w:name="List Table 4 Accent 4" w:uiPriority="49"/>
+    <w:lsdException w:name="List Table 5 Dark Accent 4" w:uiPriority="50"/>
+    <w:lsdException w:name="List Table 6 Colorful Accent 4" w:uiPriority="51"/>
+    <w:lsdException w:name="List Table 7 Colorful Accent 4" w:uiPriority="52"/>
+    <w:lsdException w:name="List Table 1 Light Accent 5" w:uiPriority="46"/>
+    <w:lsdException w:name="List Table 2 Accent 5" w:uiPriority="47"/>
+    <w:lsdException w:name="List Table 3 Accent 5" w:uiPriority="48"/>
+    <w:lsdException w:name="List Table 4 Accent 5" w:uiPriority="49"/>
+    <w:lsdException w:name="List Table 5 Dark Accent 5" w:uiPriority="50"/>
+    <w:lsdException w:name="List Table 6 Colorful Accent 5" w:uiPriority="51"/>
+    <w:lsdException w:name="List Table 7 Colorful Accent 5" w:uiPriority="52"/>
+    <w:lsdException w:name="List Table 1 Light Accent 6" w:uiPriority="46"/>
+    <w:lsdException w:name="List Table 2 Accent 6" w:uiPriority="47"/>
+    <w:lsdException w:name="List Table 3 Accent 6" w:uiPriority="48"/>
+    <w:lsdException w:name="List Table 4 Accent 6" w:uiPriority="49"/>
+    <w:lsdException w:name="List Table 5 Dark Accent 6" w:uiPriority="50"/>
+    <w:lsdException w:name="List Table 6 Colorful Accent 6" w:uiPriority="51"/>
+    <w:lsdException w:name="List Table 7 Colorful Accent 6" w:uiPriority="52"/>
+    <w:lsdException w:name="Mention" w:semiHidden="1" w:uiPriority="99" w:unhideWhenUsed="1"/>
+    <w:lsdException w:name="Smart Hyperlink" w:semiHidden="1" w:uiPriority="99" w:unhideWhenUsed="1"/>
+    <w:lsdException w:name="Hashtag" w:semiHidden="1" w:uiPriority="99" w:unhideWhenUsed="1"/>
+    <w:lsdException w:name="Unresolved Mention" w:semiHidden="1" w:uiPriority="99" w:unhideWhenUsed="1"/>
+    <w:lsdException w:name="Smart Link" w:semiHidden="1" w:uiPriority="99" w:unhideWhenUsed="1"/>
   </w:latentStyles>
-  <w:style w:type="paragraph" w:default="1" w:styleId="1">
+  <w:style w:type="paragraph" w:default="1" w:styleId="a">
     <w:name w:val="Normal"/>
     <w:qFormat/>
-    <w:uiPriority w:val="0"/>
     <w:rPr>
-      <w:rFonts w:asciiTheme="minorHAnsi" w:hAnsiTheme="minorHAnsi" w:eastAsiaTheme="minorEastAsia" w:cstheme="minorBidi"/>
-      <w:lang w:val="en-US" w:eastAsia="zh-CN" w:bidi="ar-SA"/>
+      <w:lang w:eastAsia="zh-CN" w:bidi="ar-SA"/>
     </w:rPr>
   </w:style>
-  <w:style w:type="character" w:default="1" w:styleId="2">
+  <w:style w:type="character" w:default="1" w:styleId="a0">
     <w:name w:val="Default Paragraph Font"/>
+    <w:uiPriority w:val="1"/>
     <w:semiHidden/>
-    <w:uiPriority w:val="0"/>
+    <w:unhideWhenUsed/>
   </w:style>
-  <w:style w:type="table" w:default="1" w:styleId="3">
+  <w:style w:type="table" w:default="1" w:styleId="a1">
     <w:name w:val="Normal Table"/>
+    <w:uiPriority w:val="99"/>
     <w:semiHidden/>
-    <w:uiPriority w:val="0"/>
+    <w:unhideWhenUsed/>
     <w:tblPr>
+      <w:tblInd w:w="0" w:type="dxa"/>
       <w:tblCellMar>
         <w:top w:w="0" w:type="dxa"/>
         <w:left w:w="108" w:type="dxa"/>
@@ -1007,6 +1354,12 @@
         <w:right w:w="108" w:type="dxa"/>
       </w:tblCellMar>
     </w:tblPr>
+  </w:style>
+  <w:style w:type="numbering" w:default="1" w:styleId="a2">
+    <w:name w:val="No List"/>
+    <w:uiPriority w:val="99"/>
+    <w:semiHidden/>
+    <w:unhideWhenUsed/>
   </w:style>
 </w:styles>
 </file>
@@ -1263,5 +1616,6 @@
     </a:fmtScheme>
   </a:themeElements>
   <a:objectDefaults/>
+  <a:extraClrSchemeLst/>
 </a:theme>
 </file>
</xml_diff>